<commit_message>
Design docs: time scale and project architecture in the politics doc; link and summary in the main design doc
Co-Authored-By: Claude Sonnet 5.5 <noreply@anthropic.com>
Claude-Session: https://claude.ai/code/session_01CPseNWvz5BjVLLrGyyTBid
</commit_message>
<xml_diff>
--- a/doc/Cơ chế kinh tế, chính trị, xã hội thời đồ đá.docx
+++ b/doc/Cơ chế kinh tế, chính trị, xã hội thời đồ đá.docx
@@ -48,7 +48,27 @@
           <w:sz w:val="21"/>
           <w:szCs w:val="21"/>
         </w:rPr>
-        <w:t xml:space="preserve">Tài liệu này nối tiếp "Thiết kế Thời đại Đồ đá". Nó thay phần "bộ tộc" hiện có (quan hệ, đầu hàng, cống nạp, tập kích) bằng một thế giới các làng NPC tự phát triển, có tiền tệ, có bá chủ và có những lựa chọn chính trị cho người chơi. Mọi con số là đề xuất ban đầu để chơi thử và cân bằng lại, không phải giá trị cuối. Phần "Ý kiến của tôi" và "Câu hỏi cần bạn quyết" ở cuối là chỗ cần hai bên cùng chốt.</w:t>
+        <w:t xml:space="preserve">Tài liệu này nối tiếp "Thiết kế Thời đại Đồ đá". Nó thay phần "bộ tộc" hiện có (quan hệ, đầu hàng, cống nạp, tập kích) bằng một thế giới các làng NPC tự phát triển, có tiền tệ, có bá chủ và có những lựa chọn chính trị cho người chơi. </w:t>
+      </w:r>
+      <w:r>
+        <w:rPr>
+          <w:rFonts w:ascii="Arial" w:cs="Arial" w:eastAsia="Arial" w:hAnsi="Arial"/>
+          <w:b/>
+          <w:bCs/>
+          <w:color w:val="2B2118"/>
+          <w:sz w:val="21"/>
+          <w:szCs w:val="21"/>
+        </w:rPr>
+        <w:t xml:space="preserve">Đơn vị thời gian: ngày game.</w:t>
+      </w:r>
+      <w:r>
+        <w:rPr>
+          <w:rFonts w:ascii="Arial" w:cs="Arial" w:eastAsia="Arial" w:hAnsi="Arial"/>
+          <w:color w:val="2B2118"/>
+          <w:sz w:val="21"/>
+          <w:szCs w:val="21"/>
+        </w:rPr>
+        <w:t xml:space="preserve"> Một ngày game hiện dài 20 phút thật (`DAY_LENGTH` = 1200 giây), một mùa 5 ngày (100 phút), một năm 20 ngày. Mọi mốc trong tài liệu ghi bằng ngày game, kèm quy đổi ra phút thật ở mục 5. Mọi con số là đề xuất ban đầu để chơi thử và cân bằng lại, không phải giá trị cuối. Phần "Ý kiến của tôi" và "Câu hỏi cần bạn quyết" ở cuối là chỗ cần hai bên cùng chốt.</w:t>
       </w:r>
     </w:p>
     <w:p>
@@ -960,7 +980,7 @@
                 <w:sz w:val="19"/>
                 <w:szCs w:val="19"/>
               </w:rPr>
-              <w:t xml:space="preserve">Tài liệu thiết kế hiện nhắm 2–3 giờ (ngày 30–45). Ba con đường cần thêm 15–20 ngày sau khi bá chủ xuất hiện.</w:t>
+              <w:t xml:space="preserve">Ngày game giờ dài 20 phút thật, nên lịch ngày 18–28 của bản đầu sẽ thành 6–9 giờ chơi chỉ để tới lúc bá chủ xuất hiện, và cả thời đại 15 giờ trở lên. Tài liệu thiết kế cũ nhắm 2–3 giờ với ngày 4 phút.</w:t>
             </w:r>
           </w:p>
         </w:tc>
@@ -993,7 +1013,7 @@
                 <w:sz w:val="19"/>
                 <w:szCs w:val="19"/>
               </w:rPr>
-              <w:t xml:space="preserve">Hoặc kéo dài thời đại tới ngày 45–55 (khoảng 3–3,7 giờ), hoặc cho bá chủ xuất hiện sớm hơn. Tôi nghiêng về kéo dài, vì phần chính trị là phần chơi hay nhất.</w:t>
+              <w:t xml:space="preserve">Nén lịch chính trị lại (bá chủ ngày 9–15, mỗi con đường 8–12 ngày) và chia ván thành 3–4 phiên nhờ lưu game đã có (mục 5.2).</w:t>
             </w:r>
           </w:p>
         </w:tc>
@@ -1201,7 +1221,7 @@
           <w:sz w:val="22"/>
           <w:szCs w:val="22"/>
         </w:rPr>
-        <w:t xml:space="preserve"> Kinh tế làng, chính trị, tin đồn đều xoay theo mùa 5 ngày của game, để người chơi học một nhịp và lên kế hoạch được.</w:t>
+        <w:t xml:space="preserve"> Kinh tế làng, chính trị, tin đồn đều chạy theo ngày game (20 phút thật), với vòng quyết định nhỏ mỗi ngày và vòng lớn mỗi 2 ngày, để người chơi học một nhịp và lên kế hoạch được. Mùa 5 ngày chỉ còn là nhịp thời tiết và thu hoạch.</w:t>
       </w:r>
     </w:p>
     <w:p>
@@ -2819,16 +2839,16 @@
           <w:sz w:val="22"/>
           <w:szCs w:val="22"/>
         </w:rPr>
-        <w:t xml:space="preserve">Tiến độ mỗi mùa</w:t>
-      </w:r>
-      <w:r>
-        <w:rPr>
-          <w:rFonts w:ascii="Arial" w:cs="Arial" w:eastAsia="Arial" w:hAnsi="Arial"/>
-          <w:color w:val="2B2118"/>
-          <w:sz w:val="22"/>
-          <w:szCs w:val="22"/>
-        </w:rPr>
-        <w:t xml:space="preserve"> = 10 × hệ số sản xuất × hệ số vùng × q − chi phí duy trì. Đủ 40 điểm thì lên một bậc; âm 40 thì tụt một bậc. Ví dụ: làng Giàu, vùng giàu (×1,3), thủ lĩnh khá (q = 1,0) có 10 × 1,7 × 1,3 × 1,0 ≈ 22 điểm mỗi mùa, lên bậc sau khoảng 2 mùa (10 ngày). Làng Trung bình, vùng thường, q = 1,0 chỉ được 10 điểm, mất 4 mùa. Vì vậy bá chủ thường là một trong những làng Giàu hoặc Đang phát triển ở vùng tốt, nhưng thủ lĩnh sai lầm có thể đảo thứ tự.</w:t>
+        <w:t xml:space="preserve">Tiến độ mỗi ngày game</w:t>
+      </w:r>
+      <w:r>
+        <w:rPr>
+          <w:rFonts w:ascii="Arial" w:cs="Arial" w:eastAsia="Arial" w:hAnsi="Arial"/>
+          <w:color w:val="2B2118"/>
+          <w:sz w:val="22"/>
+          <w:szCs w:val="22"/>
+        </w:rPr>
+        <w:t xml:space="preserve"> = 4 × hệ số sản xuất × hệ số vùng × q − chi phí duy trì. Đủ 40 điểm thì lên một bậc; âm 40 thì tụt một bậc. Ví dụ: làng Giàu, vùng giàu (×1,3), thủ lĩnh khá (q = 1,0) có 4 × 1,7 × 1,3 × 1,0 ≈ 8,8 điểm mỗi ngày, lên bậc sau khoảng 4,5 ngày (90 phút thật). Làng Trung bình, vùng thường, q = 1,0 chỉ được 4 điểm mỗi ngày, mất 10 ngày. Vì vậy bá chủ thường là một trong những làng Giàu hoặc Đang phát triển ở vùng tốt, nhưng thủ lĩnh sai lầm có thể đảo thứ tự.</w:t>
       </w:r>
     </w:p>
     <w:p>
@@ -2901,7 +2921,7 @@
           <w:sz w:val="22"/>
           <w:szCs w:val="22"/>
         </w:rPr>
-        <w:t xml:space="preserve">Mỗi mùa, thủ lĩnh một làng đưa ra quyết định (mở rộng, tăng quân, buôn bán, tấn công làng khác, thu thuế nặng). Xác suất quyết định sai là (1 − q) và mức hậu quả theo quy mô làng, nên làng lớn sai thì đau hơn. Các sự kiện suy yếu:</w:t>
+        <w:t xml:space="preserve">Cứ 2 ngày game, thủ lĩnh một làng đưa ra một quyết định (mở rộng, tăng quân, buôn bán, tấn công làng khác, thu thuế nặng). Xác suất quyết định sai là (1 − q) và mức hậu quả theo quy mô làng, nên làng lớn sai thì đau hơn. Các sự kiện suy yếu:</w:t>
       </w:r>
     </w:p>
     <w:tbl>
@@ -3565,7 +3585,7 @@
           <w:sz w:val="22"/>
           <w:szCs w:val="22"/>
         </w:rPr>
-        <w:t xml:space="preserve">Khi sức mạnh của một làng giảm dưới 80% của làng đứng sau trong 2 mùa liên tiếp, làng đứng sau vươn lên. Nếu đó là bá chủ thì </w:t>
+        <w:t xml:space="preserve">Khi sức mạnh của một làng giảm dưới 80% của làng đứng sau trong 4 ngày liên tiếp, làng đứng sau vươn lên. Nếu đó là bá chủ thì </w:t>
       </w:r>
       <w:r>
         <w:rPr>
@@ -4428,7 +4448,7 @@
           <w:sz w:val="22"/>
           <w:szCs w:val="22"/>
         </w:rPr>
-        <w:t xml:space="preserve">: mỗi làng chỉ mua hàng của bạn khi ví còn tiền. Ví đầy lại chậm (một phần sản lượng mỗi mùa).</w:t>
+        <w:t xml:space="preserve">: mỗi làng chỉ mua hàng của bạn khi ví còn tiền. Ví đầy lại chậm (một phần sản lượng mỗi ngày).</w:t>
       </w:r>
     </w:p>
     <w:p>
@@ -4458,7 +4478,7 @@
           <w:sz w:val="22"/>
           <w:szCs w:val="22"/>
         </w:rPr>
-        <w:t xml:space="preserve">: mỗi lần bán cùng một loại giảm giá 3%, hồi 1% mỗi ngày.</w:t>
+        <w:t xml:space="preserve">: mỗi lần bán cùng một loại giảm giá 3%, hồi 2% mỗi ngày game.</w:t>
       </w:r>
     </w:p>
     <w:p>
@@ -4600,7 +4620,7 @@
           <w:sz w:val="22"/>
           <w:szCs w:val="22"/>
         </w:rPr>
-        <w:t xml:space="preserve">Nếu bá chủ mới chọn vật làm tiền khác, tiền cũ mất giá. Người chơi giữ nhiều tiền cũ phải đổi trong một mùa ân hạn với tỷ lệ 0,6 (mất 40%), hoặc dùng cho giao dịch với các làng còn nhận. Cú sốc này là rủi ro có thật của việc cất tiền thay vì tiêu vào quân và công trình.</w:t>
+        <w:t xml:space="preserve">Nếu bá chủ mới chọn vật làm tiền khác, tiền cũ mất giá. Người chơi giữ nhiều tiền cũ phải đổi trong 2 ngày game ân hạn (40 phút thật) với tỷ lệ 0,6 (mất 40%), hoặc dùng cho giao dịch với các làng còn nhận. Cú sốc này là rủi ro có thật của việc cất tiền thay vì tiêu vào quân và công trình.</w:t>
       </w:r>
     </w:p>
     <w:p>
@@ -5130,7 +5150,27 @@
           <w:sz w:val="22"/>
           <w:szCs w:val="22"/>
         </w:rPr>
-        <w:t xml:space="preserve">Thời gian game: 1 ngày = 4 phút thật, 1 mùa = 5 ngày (20 phút), 1 năm = 20 ngày. Mọi thứ dưới đây xoay theo mùa để người chơi học một nhịp duy nhất.</w:t>
+        <w:t xml:space="preserve">Ngày game hiện dài 20 phút thật (12 phút ban ngày, 8 phút ban đêm), mùa 5 ngày, năm 20 ngày. Xây, chế tạo, nghiên cứu tính theo ngày công nên không đổi khi độ dài ngày đổi. Các mốc chính trị dưới đây ghi bằng </w:t>
+      </w:r>
+      <w:r>
+        <w:rPr>
+          <w:rFonts w:ascii="Arial" w:cs="Arial" w:eastAsia="Arial" w:hAnsi="Arial"/>
+          <w:b/>
+          <w:bCs/>
+          <w:color w:val="2B2118"/>
+          <w:sz w:val="22"/>
+          <w:szCs w:val="22"/>
+        </w:rPr>
+        <w:t xml:space="preserve">ngày game</w:t>
+      </w:r>
+      <w:r>
+        <w:rPr>
+          <w:rFonts w:ascii="Arial" w:cs="Arial" w:eastAsia="Arial" w:hAnsi="Arial"/>
+          <w:color w:val="2B2118"/>
+          <w:sz w:val="22"/>
+          <w:szCs w:val="22"/>
+        </w:rPr>
+        <w:t xml:space="preserve"> và quy ra phút thật theo ngày 20 phút. Lịch mùa và năm của game giữ nguyên, nhưng mốc chính trị đi theo ngày chứ không theo mùa, vì một mùa dài 100 phút quá chậm cho một vòng quyết định.</w:t>
       </w:r>
     </w:p>
     <w:tbl>
@@ -5147,8 +5187,9 @@
       </w:tblPr>
       <w:tblGrid>
         <w:gridCol w:w="1500"/>
-        <w:gridCol w:w="2700"/>
-        <w:gridCol w:w="5438"/>
+        <w:gridCol w:w="1500"/>
+        <w:gridCol w:w="2300"/>
+        <w:gridCol w:w="4338"/>
       </w:tblGrid>
       <w:tr>
         <w:trPr>
@@ -5184,13 +5225,13 @@
                 <w:sz w:val="19"/>
                 <w:szCs w:val="19"/>
               </w:rPr>
-              <w:t xml:space="preserve">Ngày</w:t>
-            </w:r>
-          </w:p>
-        </w:tc>
-        <w:tc>
-          <w:tcPr>
-            <w:tcW w:type="dxa" w:w="2700"/>
+              <w:t xml:space="preserve">Ngày game</w:t>
+            </w:r>
+          </w:p>
+        </w:tc>
+        <w:tc>
+          <w:tcPr>
+            <w:tcW w:type="dxa" w:w="1500"/>
             <w:tcBorders>
               <w:top w:val="single" w:color="C9B89C" w:sz="4"/>
               <w:left w:val="single" w:color="C9B89C" w:sz="4"/>
@@ -5218,13 +5259,47 @@
                 <w:sz w:val="19"/>
                 <w:szCs w:val="19"/>
               </w:rPr>
+              <w:t xml:space="preserve">Phút thật</w:t>
+            </w:r>
+          </w:p>
+        </w:tc>
+        <w:tc>
+          <w:tcPr>
+            <w:tcW w:type="dxa" w:w="2300"/>
+            <w:tcBorders>
+              <w:top w:val="single" w:color="C9B89C" w:sz="4"/>
+              <w:left w:val="single" w:color="C9B89C" w:sz="4"/>
+              <w:bottom w:val="single" w:color="C9B89C" w:sz="4"/>
+              <w:right w:val="single" w:color="C9B89C" w:sz="4"/>
+            </w:tcBorders>
+            <w:shd w:fill="EFE4D0" w:val="clear"/>
+            <w:tcMar>
+              <w:top w:type="dxa" w:w="70"/>
+              <w:left w:type="dxa" w:w="100"/>
+              <w:bottom w:type="dxa" w:w="70"/>
+              <w:right w:type="dxa" w:w="100"/>
+            </w:tcMar>
+          </w:tcPr>
+          <w:p>
+            <w:pPr>
+              <w:spacing w:after="20" w:line="260"/>
+            </w:pPr>
+            <w:r>
+              <w:rPr>
+                <w:rFonts w:ascii="Arial" w:cs="Arial" w:eastAsia="Arial" w:hAnsi="Arial"/>
+                <w:b/>
+                <w:bCs/>
+                <w:color w:val="2B2118"/>
+                <w:sz w:val="19"/>
+                <w:szCs w:val="19"/>
+              </w:rPr>
               <w:t xml:space="preserve">Giai đoạn</w:t>
             </w:r>
           </w:p>
         </w:tc>
         <w:tc>
           <w:tcPr>
-            <w:tcW w:type="dxa" w:w="5438"/>
+            <w:tcW w:type="dxa" w:w="4338"/>
             <w:tcBorders>
               <w:top w:val="single" w:color="C9B89C" w:sz="4"/>
               <w:left w:val="single" w:color="C9B89C" w:sz="4"/>
@@ -5290,29 +5365,46 @@
                 <w:sz w:val="19"/>
                 <w:szCs w:val="19"/>
               </w:rPr>
-              <w:t xml:space="preserve">1–10</w:t>
-            </w:r>
-          </w:p>
-          <w:p>
-            <w:pPr>
-              <w:spacing w:after="20" w:line="260"/>
-            </w:pPr>
-            <w:r>
-              <w:rPr>
-                <w:rFonts w:ascii="Arial" w:cs="Arial" w:eastAsia="Arial" w:hAnsi="Arial"/>
-                <w:b w:val="false"/>
-                <w:bCs w:val="false"/>
-                <w:color w:val="2B2118"/>
-                <w:sz w:val="19"/>
-                <w:szCs w:val="19"/>
-              </w:rPr>
-              <w:t xml:space="preserve">(xuân, hạ năm 1)</w:t>
-            </w:r>
-          </w:p>
-        </w:tc>
-        <w:tc>
-          <w:tcPr>
-            <w:tcW w:type="dxa" w:w="2700"/>
+              <w:t xml:space="preserve">1–3</w:t>
+            </w:r>
+          </w:p>
+        </w:tc>
+        <w:tc>
+          <w:tcPr>
+            <w:tcW w:type="dxa" w:w="1500"/>
+            <w:tcBorders>
+              <w:top w:val="single" w:color="C9B89C" w:sz="4"/>
+              <w:left w:val="single" w:color="C9B89C" w:sz="4"/>
+              <w:bottom w:val="single" w:color="C9B89C" w:sz="4"/>
+              <w:right w:val="single" w:color="C9B89C" w:sz="4"/>
+            </w:tcBorders>
+            <w:tcMar>
+              <w:top w:type="dxa" w:w="70"/>
+              <w:left w:type="dxa" w:w="100"/>
+              <w:bottom w:type="dxa" w:w="70"/>
+              <w:right w:type="dxa" w:w="100"/>
+            </w:tcMar>
+          </w:tcPr>
+          <w:p>
+            <w:pPr>
+              <w:spacing w:after="20" w:line="260"/>
+            </w:pPr>
+            <w:r>
+              <w:rPr>
+                <w:rFonts w:ascii="Arial" w:cs="Arial" w:eastAsia="Arial" w:hAnsi="Arial"/>
+                <w:b w:val="false"/>
+                <w:bCs w:val="false"/>
+                <w:color w:val="2B2118"/>
+                <w:sz w:val="19"/>
+                <w:szCs w:val="19"/>
+              </w:rPr>
+              <w:t xml:space="preserve">0–60</w:t>
+            </w:r>
+          </w:p>
+        </w:tc>
+        <w:tc>
+          <w:tcPr>
+            <w:tcW w:type="dxa" w:w="2300"/>
             <w:tcBorders>
               <w:top w:val="single" w:color="C9B89C" w:sz="4"/>
               <w:left w:val="single" w:color="C9B89C" w:sz="4"/>
@@ -5345,7 +5437,7 @@
         </w:tc>
         <w:tc>
           <w:tcPr>
-            <w:tcW w:type="dxa" w:w="5438"/>
+            <w:tcW w:type="dxa" w:w="4338"/>
             <w:tcBorders>
               <w:top w:val="single" w:color="C9B89C" w:sz="4"/>
               <w:left w:val="single" w:color="C9B89C" w:sz="4"/>
@@ -5410,13 +5502,46 @@
                 <w:sz w:val="19"/>
                 <w:szCs w:val="19"/>
               </w:rPr>
-              <w:t xml:space="preserve">6–14</w:t>
-            </w:r>
-          </w:p>
-        </w:tc>
-        <w:tc>
-          <w:tcPr>
-            <w:tcW w:type="dxa" w:w="2700"/>
+              <w:t xml:space="preserve">2–5</w:t>
+            </w:r>
+          </w:p>
+        </w:tc>
+        <w:tc>
+          <w:tcPr>
+            <w:tcW w:type="dxa" w:w="1500"/>
+            <w:tcBorders>
+              <w:top w:val="single" w:color="C9B89C" w:sz="4"/>
+              <w:left w:val="single" w:color="C9B89C" w:sz="4"/>
+              <w:bottom w:val="single" w:color="C9B89C" w:sz="4"/>
+              <w:right w:val="single" w:color="C9B89C" w:sz="4"/>
+            </w:tcBorders>
+            <w:tcMar>
+              <w:top w:type="dxa" w:w="70"/>
+              <w:left w:type="dxa" w:w="100"/>
+              <w:bottom w:type="dxa" w:w="70"/>
+              <w:right w:type="dxa" w:w="100"/>
+            </w:tcMar>
+          </w:tcPr>
+          <w:p>
+            <w:pPr>
+              <w:spacing w:after="20" w:line="260"/>
+            </w:pPr>
+            <w:r>
+              <w:rPr>
+                <w:rFonts w:ascii="Arial" w:cs="Arial" w:eastAsia="Arial" w:hAnsi="Arial"/>
+                <w:b w:val="false"/>
+                <w:bCs w:val="false"/>
+                <w:color w:val="2B2118"/>
+                <w:sz w:val="19"/>
+                <w:szCs w:val="19"/>
+              </w:rPr>
+              <w:t xml:space="preserve">20–100</w:t>
+            </w:r>
+          </w:p>
+        </w:tc>
+        <w:tc>
+          <w:tcPr>
+            <w:tcW w:type="dxa" w:w="2300"/>
             <w:tcBorders>
               <w:top w:val="single" w:color="C9B89C" w:sz="4"/>
               <w:left w:val="single" w:color="C9B89C" w:sz="4"/>
@@ -5449,7 +5574,7 @@
         </w:tc>
         <w:tc>
           <w:tcPr>
-            <w:tcW w:type="dxa" w:w="5438"/>
+            <w:tcW w:type="dxa" w:w="4338"/>
             <w:tcBorders>
               <w:top w:val="single" w:color="C9B89C" w:sz="4"/>
               <w:left w:val="single" w:color="C9B89C" w:sz="4"/>
@@ -5514,29 +5639,46 @@
                 <w:sz w:val="19"/>
                 <w:szCs w:val="19"/>
               </w:rPr>
-              <w:t xml:space="preserve">11–20</w:t>
-            </w:r>
-          </w:p>
-          <w:p>
-            <w:pPr>
-              <w:spacing w:after="20" w:line="260"/>
-            </w:pPr>
-            <w:r>
-              <w:rPr>
-                <w:rFonts w:ascii="Arial" w:cs="Arial" w:eastAsia="Arial" w:hAnsi="Arial"/>
-                <w:b w:val="false"/>
-                <w:bCs w:val="false"/>
-                <w:color w:val="2B2118"/>
-                <w:sz w:val="19"/>
-                <w:szCs w:val="19"/>
-              </w:rPr>
-              <w:t xml:space="preserve">(thu, đông năm 1)</w:t>
-            </w:r>
-          </w:p>
-        </w:tc>
-        <w:tc>
-          <w:tcPr>
-            <w:tcW w:type="dxa" w:w="2700"/>
+              <w:t xml:space="preserve">4–9</w:t>
+            </w:r>
+          </w:p>
+        </w:tc>
+        <w:tc>
+          <w:tcPr>
+            <w:tcW w:type="dxa" w:w="1500"/>
+            <w:tcBorders>
+              <w:top w:val="single" w:color="C9B89C" w:sz="4"/>
+              <w:left w:val="single" w:color="C9B89C" w:sz="4"/>
+              <w:bottom w:val="single" w:color="C9B89C" w:sz="4"/>
+              <w:right w:val="single" w:color="C9B89C" w:sz="4"/>
+            </w:tcBorders>
+            <w:tcMar>
+              <w:top w:type="dxa" w:w="70"/>
+              <w:left w:type="dxa" w:w="100"/>
+              <w:bottom w:type="dxa" w:w="70"/>
+              <w:right w:type="dxa" w:w="100"/>
+            </w:tcMar>
+          </w:tcPr>
+          <w:p>
+            <w:pPr>
+              <w:spacing w:after="20" w:line="260"/>
+            </w:pPr>
+            <w:r>
+              <w:rPr>
+                <w:rFonts w:ascii="Arial" w:cs="Arial" w:eastAsia="Arial" w:hAnsi="Arial"/>
+                <w:b w:val="false"/>
+                <w:bCs w:val="false"/>
+                <w:color w:val="2B2118"/>
+                <w:sz w:val="19"/>
+                <w:szCs w:val="19"/>
+              </w:rPr>
+              <w:t xml:space="preserve">60–180</w:t>
+            </w:r>
+          </w:p>
+        </w:tc>
+        <w:tc>
+          <w:tcPr>
+            <w:tcW w:type="dxa" w:w="2300"/>
             <w:tcBorders>
               <w:top w:val="single" w:color="C9B89C" w:sz="4"/>
               <w:left w:val="single" w:color="C9B89C" w:sz="4"/>
@@ -5569,34 +5711,34 @@
         </w:tc>
         <w:tc>
           <w:tcPr>
-            <w:tcW w:type="dxa" w:w="5438"/>
-            <w:tcBorders>
-              <w:top w:val="single" w:color="C9B89C" w:sz="4"/>
-              <w:left w:val="single" w:color="C9B89C" w:sz="4"/>
-              <w:bottom w:val="single" w:color="C9B89C" w:sz="4"/>
-              <w:right w:val="single" w:color="C9B89C" w:sz="4"/>
-            </w:tcBorders>
-            <w:tcMar>
-              <w:top w:type="dxa" w:w="70"/>
-              <w:left w:type="dxa" w:w="100"/>
-              <w:bottom w:type="dxa" w:w="70"/>
-              <w:right w:type="dxa" w:w="100"/>
-            </w:tcMar>
-          </w:tcPr>
-          <w:p>
-            <w:pPr>
-              <w:spacing w:after="20" w:line="260"/>
-            </w:pPr>
-            <w:r>
-              <w:rPr>
-                <w:rFonts w:ascii="Arial" w:cs="Arial" w:eastAsia="Arial" w:hAnsi="Arial"/>
-                <w:b w:val="false"/>
-                <w:bCs w:val="false"/>
-                <w:color w:val="2B2118"/>
-                <w:sz w:val="19"/>
-                <w:szCs w:val="19"/>
-              </w:rPr>
-              <w:t xml:space="preserve">Mỗi mùa, các làng lên hoặc xuống bậc. Khi gặp đủ 3 làng, mở bảng so sánh các làng (thông tin có độ trễ).</w:t>
+            <w:tcW w:type="dxa" w:w="4338"/>
+            <w:tcBorders>
+              <w:top w:val="single" w:color="C9B89C" w:sz="4"/>
+              <w:left w:val="single" w:color="C9B89C" w:sz="4"/>
+              <w:bottom w:val="single" w:color="C9B89C" w:sz="4"/>
+              <w:right w:val="single" w:color="C9B89C" w:sz="4"/>
+            </w:tcBorders>
+            <w:tcMar>
+              <w:top w:type="dxa" w:w="70"/>
+              <w:left w:type="dxa" w:w="100"/>
+              <w:bottom w:type="dxa" w:w="70"/>
+              <w:right w:type="dxa" w:w="100"/>
+            </w:tcMar>
+          </w:tcPr>
+          <w:p>
+            <w:pPr>
+              <w:spacing w:after="20" w:line="260"/>
+            </w:pPr>
+            <w:r>
+              <w:rPr>
+                <w:rFonts w:ascii="Arial" w:cs="Arial" w:eastAsia="Arial" w:hAnsi="Arial"/>
+                <w:b w:val="false"/>
+                <w:bCs w:val="false"/>
+                <w:color w:val="2B2118"/>
+                <w:sz w:val="19"/>
+                <w:szCs w:val="19"/>
+              </w:rPr>
+              <w:t xml:space="preserve">Các làng lên hoặc xuống bậc theo tiến độ mỗi ngày. Khi gặp đủ 3 làng, mở bảng so sánh các làng (thông tin có độ trễ).</w:t>
             </w:r>
           </w:p>
         </w:tc>
@@ -5634,29 +5776,46 @@
                 <w:sz w:val="19"/>
                 <w:szCs w:val="19"/>
               </w:rPr>
-              <w:t xml:space="preserve">18–28</w:t>
-            </w:r>
-          </w:p>
-          <w:p>
-            <w:pPr>
-              <w:spacing w:after="20" w:line="260"/>
-            </w:pPr>
-            <w:r>
-              <w:rPr>
-                <w:rFonts w:ascii="Arial" w:cs="Arial" w:eastAsia="Arial" w:hAnsi="Arial"/>
-                <w:b w:val="false"/>
-                <w:bCs w:val="false"/>
-                <w:color w:val="2B2118"/>
-                <w:sz w:val="19"/>
-                <w:szCs w:val="19"/>
-              </w:rPr>
-              <w:t xml:space="preserve">(xuân, hạ năm 2)</w:t>
-            </w:r>
-          </w:p>
-        </w:tc>
-        <w:tc>
-          <w:tcPr>
-            <w:tcW w:type="dxa" w:w="2700"/>
+              <w:t xml:space="preserve">9–15</w:t>
+            </w:r>
+          </w:p>
+        </w:tc>
+        <w:tc>
+          <w:tcPr>
+            <w:tcW w:type="dxa" w:w="1500"/>
+            <w:tcBorders>
+              <w:top w:val="single" w:color="C9B89C" w:sz="4"/>
+              <w:left w:val="single" w:color="C9B89C" w:sz="4"/>
+              <w:bottom w:val="single" w:color="C9B89C" w:sz="4"/>
+              <w:right w:val="single" w:color="C9B89C" w:sz="4"/>
+            </w:tcBorders>
+            <w:tcMar>
+              <w:top w:type="dxa" w:w="70"/>
+              <w:left w:type="dxa" w:w="100"/>
+              <w:bottom w:type="dxa" w:w="70"/>
+              <w:right w:type="dxa" w:w="100"/>
+            </w:tcMar>
+          </w:tcPr>
+          <w:p>
+            <w:pPr>
+              <w:spacing w:after="20" w:line="260"/>
+            </w:pPr>
+            <w:r>
+              <w:rPr>
+                <w:rFonts w:ascii="Arial" w:cs="Arial" w:eastAsia="Arial" w:hAnsi="Arial"/>
+                <w:b w:val="false"/>
+                <w:bCs w:val="false"/>
+                <w:color w:val="2B2118"/>
+                <w:sz w:val="19"/>
+                <w:szCs w:val="19"/>
+              </w:rPr>
+              <w:t xml:space="preserve">180–300</w:t>
+            </w:r>
+          </w:p>
+        </w:tc>
+        <w:tc>
+          <w:tcPr>
+            <w:tcW w:type="dxa" w:w="2300"/>
             <w:tcBorders>
               <w:top w:val="single" w:color="C9B89C" w:sz="4"/>
               <w:left w:val="single" w:color="C9B89C" w:sz="4"/>
@@ -5689,34 +5848,34 @@
         </w:tc>
         <w:tc>
           <w:tcPr>
-            <w:tcW w:type="dxa" w:w="5438"/>
-            <w:tcBorders>
-              <w:top w:val="single" w:color="C9B89C" w:sz="4"/>
-              <w:left w:val="single" w:color="C9B89C" w:sz="4"/>
-              <w:bottom w:val="single" w:color="C9B89C" w:sz="4"/>
-              <w:right w:val="single" w:color="C9B89C" w:sz="4"/>
-            </w:tcBorders>
-            <w:tcMar>
-              <w:top w:type="dxa" w:w="70"/>
-              <w:left w:type="dxa" w:w="100"/>
-              <w:bottom w:type="dxa" w:w="70"/>
-              <w:right w:type="dxa" w:w="100"/>
-            </w:tcMar>
-          </w:tcPr>
-          <w:p>
-            <w:pPr>
-              <w:spacing w:after="20" w:line="260"/>
-            </w:pPr>
-            <w:r>
-              <w:rPr>
-                <w:rFonts w:ascii="Arial" w:cs="Arial" w:eastAsia="Arial" w:hAnsi="Arial"/>
-                <w:b w:val="false"/>
-                <w:bCs w:val="false"/>
-                <w:color w:val="2B2118"/>
-                <w:sz w:val="19"/>
-                <w:szCs w:val="19"/>
-              </w:rPr>
-              <w:t xml:space="preserve">Bá chủ xuất hiện khi đủ điều kiện (5.1). Sớm nhất ngày 18, trung bình ngày 22, muộn nhất ngày 28. Báo trước một mùa bằng giá lệch, thương nhân mang tin, tiếng tù và.</w:t>
+            <w:tcW w:type="dxa" w:w="4338"/>
+            <w:tcBorders>
+              <w:top w:val="single" w:color="C9B89C" w:sz="4"/>
+              <w:left w:val="single" w:color="C9B89C" w:sz="4"/>
+              <w:bottom w:val="single" w:color="C9B89C" w:sz="4"/>
+              <w:right w:val="single" w:color="C9B89C" w:sz="4"/>
+            </w:tcBorders>
+            <w:tcMar>
+              <w:top w:type="dxa" w:w="70"/>
+              <w:left w:type="dxa" w:w="100"/>
+              <w:bottom w:type="dxa" w:w="70"/>
+              <w:right w:type="dxa" w:w="100"/>
+            </w:tcMar>
+          </w:tcPr>
+          <w:p>
+            <w:pPr>
+              <w:spacing w:after="20" w:line="260"/>
+            </w:pPr>
+            <w:r>
+              <w:rPr>
+                <w:rFonts w:ascii="Arial" w:cs="Arial" w:eastAsia="Arial" w:hAnsi="Arial"/>
+                <w:b w:val="false"/>
+                <w:bCs w:val="false"/>
+                <w:color w:val="2B2118"/>
+                <w:sz w:val="19"/>
+                <w:szCs w:val="19"/>
+              </w:rPr>
+              <w:t xml:space="preserve">Bá chủ xuất hiện khi đủ điều kiện (5.1). Sớm nhất ngày 9, trung bình ngày 12, muộn nhất ngày 15. Báo trước khoảng 2 ngày bằng giá lệch, thương nhân mang tin, tiếng tù và.</w:t>
             </w:r>
           </w:p>
         </w:tc>
@@ -5754,13 +5913,46 @@
                 <w:sz w:val="19"/>
                 <w:szCs w:val="19"/>
               </w:rPr>
-              <w:t xml:space="preserve">Xưng bá + 0 đến 1,5 ngày</w:t>
-            </w:r>
-          </w:p>
-        </w:tc>
-        <w:tc>
-          <w:tcPr>
-            <w:tcW w:type="dxa" w:w="2700"/>
+              <w:t xml:space="preserve">Xưng bá + 0 đến 0,5</w:t>
+            </w:r>
+          </w:p>
+        </w:tc>
+        <w:tc>
+          <w:tcPr>
+            <w:tcW w:type="dxa" w:w="1500"/>
+            <w:tcBorders>
+              <w:top w:val="single" w:color="C9B89C" w:sz="4"/>
+              <w:left w:val="single" w:color="C9B89C" w:sz="4"/>
+              <w:bottom w:val="single" w:color="C9B89C" w:sz="4"/>
+              <w:right w:val="single" w:color="C9B89C" w:sz="4"/>
+            </w:tcBorders>
+            <w:tcMar>
+              <w:top w:type="dxa" w:w="70"/>
+              <w:left w:type="dxa" w:w="100"/>
+              <w:bottom w:type="dxa" w:w="70"/>
+              <w:right w:type="dxa" w:w="100"/>
+            </w:tcMar>
+          </w:tcPr>
+          <w:p>
+            <w:pPr>
+              <w:spacing w:after="20" w:line="260"/>
+            </w:pPr>
+            <w:r>
+              <w:rPr>
+                <w:rFonts w:ascii="Arial" w:cs="Arial" w:eastAsia="Arial" w:hAnsi="Arial"/>
+                <w:b w:val="false"/>
+                <w:bCs w:val="false"/>
+                <w:color w:val="2B2118"/>
+                <w:sz w:val="19"/>
+                <w:szCs w:val="19"/>
+              </w:rPr>
+              <w:t xml:space="preserve">+0 đến 10</w:t>
+            </w:r>
+          </w:p>
+        </w:tc>
+        <w:tc>
+          <w:tcPr>
+            <w:tcW w:type="dxa" w:w="2300"/>
             <w:tcBorders>
               <w:top w:val="single" w:color="C9B89C" w:sz="4"/>
               <w:left w:val="single" w:color="C9B89C" w:sz="4"/>
@@ -5793,34 +5985,34 @@
         </w:tc>
         <w:tc>
           <w:tcPr>
-            <w:tcW w:type="dxa" w:w="5438"/>
-            <w:tcBorders>
-              <w:top w:val="single" w:color="C9B89C" w:sz="4"/>
-              <w:left w:val="single" w:color="C9B89C" w:sz="4"/>
-              <w:bottom w:val="single" w:color="C9B89C" w:sz="4"/>
-              <w:right w:val="single" w:color="C9B89C" w:sz="4"/>
-            </w:tcBorders>
-            <w:tcMar>
-              <w:top w:type="dxa" w:w="70"/>
-              <w:left w:type="dxa" w:w="100"/>
-              <w:bottom w:type="dxa" w:w="70"/>
-              <w:right w:type="dxa" w:w="100"/>
-            </w:tcMar>
-          </w:tcPr>
-          <w:p>
-            <w:pPr>
-              <w:spacing w:after="20" w:line="260"/>
-            </w:pPr>
-            <w:r>
-              <w:rPr>
-                <w:rFonts w:ascii="Arial" w:cs="Arial" w:eastAsia="Arial" w:hAnsi="Arial"/>
-                <w:b w:val="false"/>
-                <w:bCs w:val="false"/>
-                <w:color w:val="2B2118"/>
-                <w:sz w:val="19"/>
-                <w:szCs w:val="19"/>
-              </w:rPr>
-              <w:t xml:space="preserve">Sứ giả vua đến làng người chơi. Hộp thoại lựa chọn (mục 6), hạn trả lời 1,5 ngày game.</w:t>
+            <w:tcW w:type="dxa" w:w="4338"/>
+            <w:tcBorders>
+              <w:top w:val="single" w:color="C9B89C" w:sz="4"/>
+              <w:left w:val="single" w:color="C9B89C" w:sz="4"/>
+              <w:bottom w:val="single" w:color="C9B89C" w:sz="4"/>
+              <w:right w:val="single" w:color="C9B89C" w:sz="4"/>
+            </w:tcBorders>
+            <w:tcMar>
+              <w:top w:type="dxa" w:w="70"/>
+              <w:left w:type="dxa" w:w="100"/>
+              <w:bottom w:type="dxa" w:w="70"/>
+              <w:right w:type="dxa" w:w="100"/>
+            </w:tcMar>
+          </w:tcPr>
+          <w:p>
+            <w:pPr>
+              <w:spacing w:after="20" w:line="260"/>
+            </w:pPr>
+            <w:r>
+              <w:rPr>
+                <w:rFonts w:ascii="Arial" w:cs="Arial" w:eastAsia="Arial" w:hAnsi="Arial"/>
+                <w:b w:val="false"/>
+                <w:bCs w:val="false"/>
+                <w:color w:val="2B2118"/>
+                <w:sz w:val="19"/>
+                <w:szCs w:val="19"/>
+              </w:rPr>
+              <w:t xml:space="preserve">Sứ giả vua đến làng người chơi. Hộp thoại lựa chọn (mục 6), hạn trả lời 0,5 ngày game (10 phút thật). Có lưu game trước khi hiện.</w:t>
             </w:r>
           </w:p>
         </w:tc>
@@ -5858,13 +6050,46 @@
                 <w:sz w:val="19"/>
                 <w:szCs w:val="19"/>
               </w:rPr>
-              <w:t xml:space="preserve">Sau sứ giả, 15–25 ngày</w:t>
-            </w:r>
-          </w:p>
-        </w:tc>
-        <w:tc>
-          <w:tcPr>
-            <w:tcW w:type="dxa" w:w="2700"/>
+              <w:t xml:space="preserve">Sau sứ giả, 8–12 ngày</w:t>
+            </w:r>
+          </w:p>
+        </w:tc>
+        <w:tc>
+          <w:tcPr>
+            <w:tcW w:type="dxa" w:w="1500"/>
+            <w:tcBorders>
+              <w:top w:val="single" w:color="C9B89C" w:sz="4"/>
+              <w:left w:val="single" w:color="C9B89C" w:sz="4"/>
+              <w:bottom w:val="single" w:color="C9B89C" w:sz="4"/>
+              <w:right w:val="single" w:color="C9B89C" w:sz="4"/>
+            </w:tcBorders>
+            <w:tcMar>
+              <w:top w:type="dxa" w:w="70"/>
+              <w:left w:type="dxa" w:w="100"/>
+              <w:bottom w:type="dxa" w:w="70"/>
+              <w:right w:type="dxa" w:w="100"/>
+            </w:tcMar>
+          </w:tcPr>
+          <w:p>
+            <w:pPr>
+              <w:spacing w:after="20" w:line="260"/>
+            </w:pPr>
+            <w:r>
+              <w:rPr>
+                <w:rFonts w:ascii="Arial" w:cs="Arial" w:eastAsia="Arial" w:hAnsi="Arial"/>
+                <w:b w:val="false"/>
+                <w:bCs w:val="false"/>
+                <w:color w:val="2B2118"/>
+                <w:sz w:val="19"/>
+                <w:szCs w:val="19"/>
+              </w:rPr>
+              <w:t xml:space="preserve">160–240</w:t>
+            </w:r>
+          </w:p>
+        </w:tc>
+        <w:tc>
+          <w:tcPr>
+            <w:tcW w:type="dxa" w:w="2300"/>
             <w:tcBorders>
               <w:top w:val="single" w:color="C9B89C" w:sz="4"/>
               <w:left w:val="single" w:color="C9B89C" w:sz="4"/>
@@ -5897,7 +6122,7 @@
         </w:tc>
         <w:tc>
           <w:tcPr>
-            <w:tcW w:type="dxa" w:w="5438"/>
+            <w:tcW w:type="dxa" w:w="4338"/>
             <w:tcBorders>
               <w:top w:val="single" w:color="C9B89C" w:sz="4"/>
               <w:left w:val="single" w:color="C9B89C" w:sz="4"/>
@@ -5962,13 +6187,46 @@
                 <w:sz w:val="19"/>
                 <w:szCs w:val="19"/>
               </w:rPr>
-              <w:t xml:space="preserve">Ngày 40–55</w:t>
-            </w:r>
-          </w:p>
-        </w:tc>
-        <w:tc>
-          <w:tcPr>
-            <w:tcW w:type="dxa" w:w="2700"/>
+              <w:t xml:space="preserve">Ngày 22–30</w:t>
+            </w:r>
+          </w:p>
+        </w:tc>
+        <w:tc>
+          <w:tcPr>
+            <w:tcW w:type="dxa" w:w="1500"/>
+            <w:tcBorders>
+              <w:top w:val="single" w:color="C9B89C" w:sz="4"/>
+              <w:left w:val="single" w:color="C9B89C" w:sz="4"/>
+              <w:bottom w:val="single" w:color="C9B89C" w:sz="4"/>
+              <w:right w:val="single" w:color="C9B89C" w:sz="4"/>
+            </w:tcBorders>
+            <w:tcMar>
+              <w:top w:type="dxa" w:w="70"/>
+              <w:left w:type="dxa" w:w="100"/>
+              <w:bottom w:type="dxa" w:w="70"/>
+              <w:right w:type="dxa" w:w="100"/>
+            </w:tcMar>
+          </w:tcPr>
+          <w:p>
+            <w:pPr>
+              <w:spacing w:after="20" w:line="260"/>
+            </w:pPr>
+            <w:r>
+              <w:rPr>
+                <w:rFonts w:ascii="Arial" w:cs="Arial" w:eastAsia="Arial" w:hAnsi="Arial"/>
+                <w:b w:val="false"/>
+                <w:bCs w:val="false"/>
+                <w:color w:val="2B2118"/>
+                <w:sz w:val="19"/>
+                <w:szCs w:val="19"/>
+              </w:rPr>
+              <w:t xml:space="preserve">440–600</w:t>
+            </w:r>
+          </w:p>
+        </w:tc>
+        <w:tc>
+          <w:tcPr>
+            <w:tcW w:type="dxa" w:w="2300"/>
             <w:tcBorders>
               <w:top w:val="single" w:color="C9B89C" w:sz="4"/>
               <w:left w:val="single" w:color="C9B89C" w:sz="4"/>
@@ -6001,7 +6259,7 @@
         </w:tc>
         <w:tc>
           <w:tcPr>
-            <w:tcW w:type="dxa" w:w="5438"/>
+            <w:tcW w:type="dxa" w:w="4338"/>
             <w:tcBorders>
               <w:top w:val="single" w:color="C9B89C" w:sz="4"/>
               <w:left w:val="single" w:color="C9B89C" w:sz="4"/>
@@ -6072,7 +6330,7 @@
           <w:sz w:val="22"/>
           <w:szCs w:val="22"/>
         </w:rPr>
-        <w:t xml:space="preserve">Ngày game từ 18 trở đi (không quá sớm).</w:t>
+        <w:t xml:space="preserve">Ngày game từ 9 trở đi (không quá sớm).</w:t>
       </w:r>
     </w:p>
     <w:p>
@@ -6111,7 +6369,7 @@
           <w:sz w:val="22"/>
           <w:szCs w:val="22"/>
         </w:rPr>
-        <w:t xml:space="preserve"> ≥ 1,25 × làng đứng nhì, giữ liên tục 3 ngày.</w:t>
+        <w:t xml:space="preserve"> ≥ 1,25 × làng đứng nhì, giữ liên tục 2 ngày.</w:t>
       </w:r>
     </w:p>
     <w:p>
@@ -6151,7 +6409,7 @@
           <w:sz w:val="22"/>
           <w:szCs w:val="22"/>
         </w:rPr>
-        <w:t xml:space="preserve">Hạn chót ngày 28</w:t>
+        <w:t xml:space="preserve">Hạn chót ngày 15</w:t>
       </w:r>
       <w:r>
         <w:rPr>
@@ -6207,7 +6465,7 @@
           <w:sz w:val="25"/>
           <w:szCs w:val="25"/>
         </w:rPr>
-        <w:t xml:space="preserve">5.2 Về chuyện xem lại cơ cấu thời gian</w:t>
+        <w:t xml:space="preserve">5.2 Cơ cấu thời gian: ba phương án</w:t>
       </w:r>
     </w:p>
     <w:p>
@@ -6221,18 +6479,464 @@
           <w:sz w:val="22"/>
           <w:szCs w:val="22"/>
         </w:rPr>
-        <w:t xml:space="preserve">Tài liệu thiết kế hiện nhắm kết thúc thời đại ở ngày 30–45. Nếu bá chủ xuất hiện ngày 22 và mỗi con đường cần 15–25 ngày, thời đại sẽ kéo tới ngày 40–55. Có ba cách:</w:t>
-      </w:r>
-    </w:p>
-    <w:p>
-      <w:pPr>
-        <w:pStyle w:val="ListParagraph"/>
-        <w:numPr>
-          <w:ilvl w:val="0"/>
-          <w:numId w:val="2"/>
-        </w:numPr>
-        <w:spacing w:after="70" w:line="290"/>
-      </w:pPr>
+        <w:t xml:space="preserve">Tài liệu "Thiết kế Thời đại Đồ đá" tính với ngày 4 phút và thời đại 2–3 giờ (ngày 30–45). Với ngày 20 phút như hiện nay, cùng số ngày đó là 10–15 giờ, nên phải chọn một trong ba hướng:</w:t>
+      </w:r>
+    </w:p>
+    <w:tbl>
+      <w:tblPr>
+        <w:tblW w:type="dxa" w:w="9638"/>
+        <w:tblBorders>
+          <w:top w:val="single" w:color="auto" w:sz="4"/>
+          <w:left w:val="single" w:color="auto" w:sz="4"/>
+          <w:bottom w:val="single" w:color="auto" w:sz="4"/>
+          <w:right w:val="single" w:color="auto" w:sz="4"/>
+          <w:insideH w:val="single" w:color="auto" w:sz="4"/>
+          <w:insideV w:val="single" w:color="auto" w:sz="4"/>
+        </w:tblBorders>
+      </w:tblPr>
+      <w:tblGrid>
+        <w:gridCol w:w="2300"/>
+        <w:gridCol w:w="3500"/>
+        <w:gridCol w:w="3838"/>
+      </w:tblGrid>
+      <w:tr>
+        <w:trPr>
+          <w:tblHeader/>
+        </w:trPr>
+        <w:tc>
+          <w:tcPr>
+            <w:tcW w:type="dxa" w:w="2300"/>
+            <w:tcBorders>
+              <w:top w:val="single" w:color="C9B89C" w:sz="4"/>
+              <w:left w:val="single" w:color="C9B89C" w:sz="4"/>
+              <w:bottom w:val="single" w:color="C9B89C" w:sz="4"/>
+              <w:right w:val="single" w:color="C9B89C" w:sz="4"/>
+            </w:tcBorders>
+            <w:shd w:fill="EFE4D0" w:val="clear"/>
+            <w:tcMar>
+              <w:top w:type="dxa" w:w="70"/>
+              <w:left w:type="dxa" w:w="100"/>
+              <w:bottom w:type="dxa" w:w="70"/>
+              <w:right w:type="dxa" w:w="100"/>
+            </w:tcMar>
+          </w:tcPr>
+          <w:p>
+            <w:pPr>
+              <w:spacing w:after="20" w:line="260"/>
+            </w:pPr>
+            <w:r>
+              <w:rPr>
+                <w:rFonts w:ascii="Arial" w:cs="Arial" w:eastAsia="Arial" w:hAnsi="Arial"/>
+                <w:b/>
+                <w:bCs/>
+                <w:color w:val="2B2118"/>
+                <w:sz w:val="19"/>
+                <w:szCs w:val="19"/>
+              </w:rPr>
+              <w:t xml:space="preserve">Phương án</w:t>
+            </w:r>
+          </w:p>
+        </w:tc>
+        <w:tc>
+          <w:tcPr>
+            <w:tcW w:type="dxa" w:w="3500"/>
+            <w:tcBorders>
+              <w:top w:val="single" w:color="C9B89C" w:sz="4"/>
+              <w:left w:val="single" w:color="C9B89C" w:sz="4"/>
+              <w:bottom w:val="single" w:color="C9B89C" w:sz="4"/>
+              <w:right w:val="single" w:color="C9B89C" w:sz="4"/>
+            </w:tcBorders>
+            <w:shd w:fill="EFE4D0" w:val="clear"/>
+            <w:tcMar>
+              <w:top w:type="dxa" w:w="70"/>
+              <w:left w:type="dxa" w:w="100"/>
+              <w:bottom w:type="dxa" w:w="70"/>
+              <w:right w:type="dxa" w:w="100"/>
+            </w:tcMar>
+          </w:tcPr>
+          <w:p>
+            <w:pPr>
+              <w:spacing w:after="20" w:line="260"/>
+            </w:pPr>
+            <w:r>
+              <w:rPr>
+                <w:rFonts w:ascii="Arial" w:cs="Arial" w:eastAsia="Arial" w:hAnsi="Arial"/>
+                <w:b/>
+                <w:bCs/>
+                <w:color w:val="2B2118"/>
+                <w:sz w:val="19"/>
+                <w:szCs w:val="19"/>
+              </w:rPr>
+              <w:t xml:space="preserve">Thời lượng</w:t>
+            </w:r>
+          </w:p>
+        </w:tc>
+        <w:tc>
+          <w:tcPr>
+            <w:tcW w:type="dxa" w:w="3838"/>
+            <w:tcBorders>
+              <w:top w:val="single" w:color="C9B89C" w:sz="4"/>
+              <w:left w:val="single" w:color="C9B89C" w:sz="4"/>
+              <w:bottom w:val="single" w:color="C9B89C" w:sz="4"/>
+              <w:right w:val="single" w:color="C9B89C" w:sz="4"/>
+            </w:tcBorders>
+            <w:shd w:fill="EFE4D0" w:val="clear"/>
+            <w:tcMar>
+              <w:top w:type="dxa" w:w="70"/>
+              <w:left w:type="dxa" w:w="100"/>
+              <w:bottom w:type="dxa" w:w="70"/>
+              <w:right w:type="dxa" w:w="100"/>
+            </w:tcMar>
+          </w:tcPr>
+          <w:p>
+            <w:pPr>
+              <w:spacing w:after="20" w:line="260"/>
+            </w:pPr>
+            <w:r>
+              <w:rPr>
+                <w:rFonts w:ascii="Arial" w:cs="Arial" w:eastAsia="Arial" w:hAnsi="Arial"/>
+                <w:b/>
+                <w:bCs/>
+                <w:color w:val="2B2118"/>
+                <w:sz w:val="19"/>
+                <w:szCs w:val="19"/>
+              </w:rPr>
+              <w:t xml:space="preserve">Đánh đổi</w:t>
+            </w:r>
+          </w:p>
+        </w:tc>
+      </w:tr>
+      <w:tr>
+        <w:trPr>
+          <w:cantSplit/>
+        </w:trPr>
+        <w:tc>
+          <w:tcPr>
+            <w:tcW w:type="dxa" w:w="2300"/>
+            <w:tcBorders>
+              <w:top w:val="single" w:color="C9B89C" w:sz="4"/>
+              <w:left w:val="single" w:color="C9B89C" w:sz="4"/>
+              <w:bottom w:val="single" w:color="C9B89C" w:sz="4"/>
+              <w:right w:val="single" w:color="C9B89C" w:sz="4"/>
+            </w:tcBorders>
+            <w:tcMar>
+              <w:top w:type="dxa" w:w="70"/>
+              <w:left w:type="dxa" w:w="100"/>
+              <w:bottom w:type="dxa" w:w="70"/>
+              <w:right w:type="dxa" w:w="100"/>
+            </w:tcMar>
+          </w:tcPr>
+          <w:p>
+            <w:pPr>
+              <w:spacing w:after="20" w:line="260"/>
+            </w:pPr>
+            <w:r>
+              <w:rPr>
+                <w:rFonts w:ascii="Arial" w:cs="Arial" w:eastAsia="Arial" w:hAnsi="Arial"/>
+                <w:b w:val="false"/>
+                <w:bCs w:val="false"/>
+                <w:color w:val="2B2118"/>
+                <w:sz w:val="19"/>
+                <w:szCs w:val="19"/>
+              </w:rPr>
+              <w:t xml:space="preserve">A. Giữ lịch ngày cũ (bá chủ ngày 18–28)</w:t>
+            </w:r>
+          </w:p>
+        </w:tc>
+        <w:tc>
+          <w:tcPr>
+            <w:tcW w:type="dxa" w:w="3500"/>
+            <w:tcBorders>
+              <w:top w:val="single" w:color="C9B89C" w:sz="4"/>
+              <w:left w:val="single" w:color="C9B89C" w:sz="4"/>
+              <w:bottom w:val="single" w:color="C9B89C" w:sz="4"/>
+              <w:right w:val="single" w:color="C9B89C" w:sz="4"/>
+            </w:tcBorders>
+            <w:tcMar>
+              <w:top w:type="dxa" w:w="70"/>
+              <w:left w:type="dxa" w:w="100"/>
+              <w:bottom w:type="dxa" w:w="70"/>
+              <w:right w:type="dxa" w:w="100"/>
+            </w:tcMar>
+          </w:tcPr>
+          <w:p>
+            <w:pPr>
+              <w:spacing w:after="20" w:line="260"/>
+            </w:pPr>
+            <w:r>
+              <w:rPr>
+                <w:rFonts w:ascii="Arial" w:cs="Arial" w:eastAsia="Arial" w:hAnsi="Arial"/>
+                <w:b w:val="false"/>
+                <w:bCs w:val="false"/>
+                <w:color w:val="2B2118"/>
+                <w:sz w:val="19"/>
+                <w:szCs w:val="19"/>
+              </w:rPr>
+              <w:t xml:space="preserve">Tới bá chủ 6–9 giờ; cả thời đại 15 giờ trở lên.</w:t>
+            </w:r>
+          </w:p>
+        </w:tc>
+        <w:tc>
+          <w:tcPr>
+            <w:tcW w:type="dxa" w:w="3838"/>
+            <w:tcBorders>
+              <w:top w:val="single" w:color="C9B89C" w:sz="4"/>
+              <w:left w:val="single" w:color="C9B89C" w:sz="4"/>
+              <w:bottom w:val="single" w:color="C9B89C" w:sz="4"/>
+              <w:right w:val="single" w:color="C9B89C" w:sz="4"/>
+            </w:tcBorders>
+            <w:tcMar>
+              <w:top w:type="dxa" w:w="70"/>
+              <w:left w:type="dxa" w:w="100"/>
+              <w:bottom w:type="dxa" w:w="70"/>
+              <w:right w:type="dxa" w:w="100"/>
+            </w:tcMar>
+          </w:tcPr>
+          <w:p>
+            <w:pPr>
+              <w:spacing w:after="20" w:line="260"/>
+            </w:pPr>
+            <w:r>
+              <w:rPr>
+                <w:rFonts w:ascii="Arial" w:cs="Arial" w:eastAsia="Arial" w:hAnsi="Arial"/>
+                <w:b w:val="false"/>
+                <w:bCs w:val="false"/>
+                <w:color w:val="2B2118"/>
+                <w:sz w:val="19"/>
+                <w:szCs w:val="19"/>
+              </w:rPr>
+              <w:t xml:space="preserve">Không ai chơi liền một mạch; chỉ hợp nếu coi đây là game dài hơi nhiều phiên.</w:t>
+            </w:r>
+          </w:p>
+        </w:tc>
+      </w:tr>
+      <w:tr>
+        <w:trPr>
+          <w:cantSplit/>
+        </w:trPr>
+        <w:tc>
+          <w:tcPr>
+            <w:tcW w:type="dxa" w:w="2300"/>
+            <w:tcBorders>
+              <w:top w:val="single" w:color="C9B89C" w:sz="4"/>
+              <w:left w:val="single" w:color="C9B89C" w:sz="4"/>
+              <w:bottom w:val="single" w:color="C9B89C" w:sz="4"/>
+              <w:right w:val="single" w:color="C9B89C" w:sz="4"/>
+            </w:tcBorders>
+            <w:tcMar>
+              <w:top w:type="dxa" w:w="70"/>
+              <w:left w:type="dxa" w:w="100"/>
+              <w:bottom w:type="dxa" w:w="70"/>
+              <w:right w:type="dxa" w:w="100"/>
+            </w:tcMar>
+          </w:tcPr>
+          <w:p>
+            <w:pPr>
+              <w:spacing w:after="20" w:line="260"/>
+            </w:pPr>
+            <w:r>
+              <w:rPr>
+                <w:rFonts w:ascii="Arial" w:cs="Arial" w:eastAsia="Arial" w:hAnsi="Arial"/>
+                <w:b w:val="false"/>
+                <w:bCs w:val="false"/>
+                <w:color w:val="2B2118"/>
+                <w:sz w:val="19"/>
+                <w:szCs w:val="19"/>
+              </w:rPr>
+              <w:t xml:space="preserve">B. Nén lịch chính trị (đề xuất): bá chủ ngày 9–15, mỗi con đường 8–12 ngày</w:t>
+            </w:r>
+          </w:p>
+        </w:tc>
+        <w:tc>
+          <w:tcPr>
+            <w:tcW w:type="dxa" w:w="3500"/>
+            <w:tcBorders>
+              <w:top w:val="single" w:color="C9B89C" w:sz="4"/>
+              <w:left w:val="single" w:color="C9B89C" w:sz="4"/>
+              <w:bottom w:val="single" w:color="C9B89C" w:sz="4"/>
+              <w:right w:val="single" w:color="C9B89C" w:sz="4"/>
+            </w:tcBorders>
+            <w:tcMar>
+              <w:top w:type="dxa" w:w="70"/>
+              <w:left w:type="dxa" w:w="100"/>
+              <w:bottom w:type="dxa" w:w="70"/>
+              <w:right w:type="dxa" w:w="100"/>
+            </w:tcMar>
+          </w:tcPr>
+          <w:p>
+            <w:pPr>
+              <w:spacing w:after="20" w:line="260"/>
+            </w:pPr>
+            <w:r>
+              <w:rPr>
+                <w:rFonts w:ascii="Arial" w:cs="Arial" w:eastAsia="Arial" w:hAnsi="Arial"/>
+                <w:b w:val="false"/>
+                <w:bCs w:val="false"/>
+                <w:color w:val="2B2118"/>
+                <w:sz w:val="19"/>
+                <w:szCs w:val="19"/>
+              </w:rPr>
+              <w:t xml:space="preserve">Thời đại ngày 22–30 (7–10 giờ), chia 3–4 phiên 2–3 giờ.</w:t>
+            </w:r>
+          </w:p>
+        </w:tc>
+        <w:tc>
+          <w:tcPr>
+            <w:tcW w:type="dxa" w:w="3838"/>
+            <w:tcBorders>
+              <w:top w:val="single" w:color="C9B89C" w:sz="4"/>
+              <w:left w:val="single" w:color="C9B89C" w:sz="4"/>
+              <w:bottom w:val="single" w:color="C9B89C" w:sz="4"/>
+              <w:right w:val="single" w:color="C9B89C" w:sz="4"/>
+            </w:tcBorders>
+            <w:tcMar>
+              <w:top w:type="dxa" w:w="70"/>
+              <w:left w:type="dxa" w:w="100"/>
+              <w:bottom w:type="dxa" w:w="70"/>
+              <w:right w:type="dxa" w:w="100"/>
+            </w:tcMar>
+          </w:tcPr>
+          <w:p>
+            <w:pPr>
+              <w:spacing w:after="20" w:line="260"/>
+            </w:pPr>
+            <w:r>
+              <w:rPr>
+                <w:rFonts w:ascii="Arial" w:cs="Arial" w:eastAsia="Arial" w:hAnsi="Arial"/>
+                <w:b w:val="false"/>
+                <w:bCs w:val="false"/>
+                <w:color w:val="2B2118"/>
+                <w:sz w:val="19"/>
+                <w:szCs w:val="19"/>
+              </w:rPr>
+              <w:t xml:space="preserve">Phần sinh tồn và chính trị chồng lên nhau nhiều hơn; cần chạy thử xem kinh tế làng đủ phát triển để chọn đường chưa.</w:t>
+            </w:r>
+          </w:p>
+        </w:tc>
+      </w:tr>
+      <w:tr>
+        <w:trPr>
+          <w:cantSplit/>
+        </w:trPr>
+        <w:tc>
+          <w:tcPr>
+            <w:tcW w:type="dxa" w:w="2300"/>
+            <w:tcBorders>
+              <w:top w:val="single" w:color="C9B89C" w:sz="4"/>
+              <w:left w:val="single" w:color="C9B89C" w:sz="4"/>
+              <w:bottom w:val="single" w:color="C9B89C" w:sz="4"/>
+              <w:right w:val="single" w:color="C9B89C" w:sz="4"/>
+            </w:tcBorders>
+            <w:tcMar>
+              <w:top w:type="dxa" w:w="70"/>
+              <w:left w:type="dxa" w:w="100"/>
+              <w:bottom w:type="dxa" w:w="70"/>
+              <w:right w:type="dxa" w:w="100"/>
+            </w:tcMar>
+          </w:tcPr>
+          <w:p>
+            <w:pPr>
+              <w:spacing w:after="20" w:line="260"/>
+            </w:pPr>
+            <w:r>
+              <w:rPr>
+                <w:rFonts w:ascii="Arial" w:cs="Arial" w:eastAsia="Arial" w:hAnsi="Arial"/>
+                <w:b w:val="false"/>
+                <w:bCs w:val="false"/>
+                <w:color w:val="2B2118"/>
+                <w:sz w:val="19"/>
+                <w:szCs w:val="19"/>
+              </w:rPr>
+              <w:t xml:space="preserve">C. Đưa ngày game về 4 phút</w:t>
+            </w:r>
+          </w:p>
+        </w:tc>
+        <w:tc>
+          <w:tcPr>
+            <w:tcW w:type="dxa" w:w="3500"/>
+            <w:tcBorders>
+              <w:top w:val="single" w:color="C9B89C" w:sz="4"/>
+              <w:left w:val="single" w:color="C9B89C" w:sz="4"/>
+              <w:bottom w:val="single" w:color="C9B89C" w:sz="4"/>
+              <w:right w:val="single" w:color="C9B89C" w:sz="4"/>
+            </w:tcBorders>
+            <w:tcMar>
+              <w:top w:type="dxa" w:w="70"/>
+              <w:left w:type="dxa" w:w="100"/>
+              <w:bottom w:type="dxa" w:w="70"/>
+              <w:right w:type="dxa" w:w="100"/>
+            </w:tcMar>
+          </w:tcPr>
+          <w:p>
+            <w:pPr>
+              <w:spacing w:after="20" w:line="260"/>
+            </w:pPr>
+            <w:r>
+              <w:rPr>
+                <w:rFonts w:ascii="Arial" w:cs="Arial" w:eastAsia="Arial" w:hAnsi="Arial"/>
+                <w:b w:val="false"/>
+                <w:bCs w:val="false"/>
+                <w:color w:val="2B2118"/>
+                <w:sz w:val="19"/>
+                <w:szCs w:val="19"/>
+              </w:rPr>
+              <w:t xml:space="preserve">Đúng 2–3 giờ như tài liệu cũ.</w:t>
+            </w:r>
+          </w:p>
+        </w:tc>
+        <w:tc>
+          <w:tcPr>
+            <w:tcW w:type="dxa" w:w="3838"/>
+            <w:tcBorders>
+              <w:top w:val="single" w:color="C9B89C" w:sz="4"/>
+              <w:left w:val="single" w:color="C9B89C" w:sz="4"/>
+              <w:bottom w:val="single" w:color="C9B89C" w:sz="4"/>
+              <w:right w:val="single" w:color="C9B89C" w:sz="4"/>
+            </w:tcBorders>
+            <w:tcMar>
+              <w:top w:type="dxa" w:w="70"/>
+              <w:left w:type="dxa" w:w="100"/>
+              <w:bottom w:type="dxa" w:w="70"/>
+              <w:right w:type="dxa" w:w="100"/>
+            </w:tcMar>
+          </w:tcPr>
+          <w:p>
+            <w:pPr>
+              <w:spacing w:after="20" w:line="260"/>
+            </w:pPr>
+            <w:r>
+              <w:rPr>
+                <w:rFonts w:ascii="Arial" w:cs="Arial" w:eastAsia="Arial" w:hAnsi="Arial"/>
+                <w:b w:val="false"/>
+                <w:bCs w:val="false"/>
+                <w:color w:val="2B2118"/>
+                <w:sz w:val="19"/>
+                <w:szCs w:val="19"/>
+              </w:rPr>
+              <w:t xml:space="preserve">Phải chỉnh lại hệ thống sức, ngủ, ca làm, thu hoạch vừa làm cho ngày 20 phút.</w:t>
+            </w:r>
+          </w:p>
+        </w:tc>
+      </w:tr>
+    </w:tbl>
+    <w:p>
+      <w:pPr>
+        <w:spacing w:after="100"/>
+      </w:pPr>
+    </w:p>
+    <w:p>
+      <w:pPr>
+        <w:spacing w:after="120" w:line="300"/>
+      </w:pPr>
+      <w:r>
+        <w:rPr>
+          <w:rFonts w:ascii="Arial" w:cs="Arial" w:eastAsia="Arial" w:hAnsi="Arial"/>
+          <w:color w:val="2B2118"/>
+          <w:sz w:val="22"/>
+          <w:szCs w:val="22"/>
+        </w:rPr>
+        <w:t xml:space="preserve">Tôi chọn </w:t>
+      </w:r>
       <w:r>
         <w:rPr>
           <w:rFonts w:ascii="Arial" w:cs="Arial" w:eastAsia="Arial" w:hAnsi="Arial"/>
@@ -6242,76 +6946,16 @@
           <w:sz w:val="22"/>
           <w:szCs w:val="22"/>
         </w:rPr>
-        <w:t xml:space="preserve">Kéo dài thời đại</w:t>
-      </w:r>
-      <w:r>
-        <w:rPr>
-          <w:rFonts w:ascii="Arial" w:cs="Arial" w:eastAsia="Arial" w:hAnsi="Arial"/>
-          <w:color w:val="2B2118"/>
-          <w:sz w:val="22"/>
-          <w:szCs w:val="22"/>
-        </w:rPr>
-        <w:t xml:space="preserve"> tới ngày 45–55 (khoảng 3–3,7 giờ chơi). Tôi nghiêng về cách này.</w:t>
-      </w:r>
-    </w:p>
-    <w:p>
-      <w:pPr>
-        <w:pStyle w:val="ListParagraph"/>
-        <w:numPr>
-          <w:ilvl w:val="0"/>
-          <w:numId w:val="2"/>
-        </w:numPr>
-        <w:spacing w:after="70" w:line="290"/>
-      </w:pPr>
-      <w:r>
-        <w:rPr>
-          <w:rFonts w:ascii="Arial" w:cs="Arial" w:eastAsia="Arial" w:hAnsi="Arial"/>
-          <w:b/>
-          <w:bCs/>
-          <w:color w:val="2B2118"/>
-          <w:sz w:val="22"/>
-          <w:szCs w:val="22"/>
-        </w:rPr>
-        <w:t xml:space="preserve">Rút ngắn</w:t>
-      </w:r>
-      <w:r>
-        <w:rPr>
-          <w:rFonts w:ascii="Arial" w:cs="Arial" w:eastAsia="Arial" w:hAnsi="Arial"/>
-          <w:color w:val="2B2118"/>
-          <w:sz w:val="22"/>
-          <w:szCs w:val="22"/>
-        </w:rPr>
-        <w:t xml:space="preserve">: bá chủ xuất hiện sớm (ngày 16–20) và mỗi con đường 12–18 ngày. Rủi ro là người chơi chưa kịp có làng đủ lớn để chọn gì.</w:t>
-      </w:r>
-    </w:p>
-    <w:p>
-      <w:pPr>
-        <w:pStyle w:val="ListParagraph"/>
-        <w:numPr>
-          <w:ilvl w:val="0"/>
-          <w:numId w:val="2"/>
-        </w:numPr>
-        <w:spacing w:after="70" w:line="290"/>
-      </w:pPr>
-      <w:r>
-        <w:rPr>
-          <w:rFonts w:ascii="Arial" w:cs="Arial" w:eastAsia="Arial" w:hAnsi="Arial"/>
-          <w:b/>
-          <w:bCs/>
-          <w:color w:val="2B2118"/>
-          <w:sz w:val="22"/>
-          <w:szCs w:val="22"/>
-        </w:rPr>
-        <w:t xml:space="preserve">Tách hai phiên</w:t>
-      </w:r>
-      <w:r>
-        <w:rPr>
-          <w:rFonts w:ascii="Arial" w:cs="Arial" w:eastAsia="Arial" w:hAnsi="Arial"/>
-          <w:color w:val="2B2118"/>
-          <w:sz w:val="22"/>
-          <w:szCs w:val="22"/>
-        </w:rPr>
-        <w:t xml:space="preserve">: phiên 1 từ đầu tới sứ giả, phiên 2 là cuộc đấu với bá chủ, có tự lưu giữa chừng. Cách này cần hệ thống lưu game, nên làm sau.</w:t>
+        <w:t xml:space="preserve">B</w:t>
+      </w:r>
+      <w:r>
+        <w:rPr>
+          <w:rFonts w:ascii="Arial" w:cs="Arial" w:eastAsia="Arial" w:hAnsi="Arial"/>
+          <w:color w:val="2B2118"/>
+          <w:sz w:val="22"/>
+          <w:szCs w:val="22"/>
+        </w:rPr>
+        <w:t xml:space="preserve"> làm mặc định cho các con số trong tài liệu này. Hệ thống lưu game đã có (tự lưu đầu mỗi ngày, tiếp tục ván cũ) nên phiên chơi có thể ngắt ở những chỗ tự nhiên: ngay trước khi sứ giả đến, sau khi chọn con đường, và trước khi Dựng cờ hoặc hạn thử thách cuối. Nếu chọn A hay C thì mọi hạn và tốc độ ở mục 3, 4, 7 và 10 nhân hoặc chia theo tỷ lệ.</w:t>
       </w:r>
     </w:p>
     <w:p>
@@ -6345,7 +6989,7 @@
           <w:sz w:val="22"/>
           <w:szCs w:val="22"/>
         </w:rPr>
-        <w:t xml:space="preserve">Sứ giả đến làng người chơi cùng vài lính hộ tống, thông báo bá chủ đã ra đời, tiền chuẩn mới, và yêu cầu làng thần phục: nộp cống mỗi mùa, chấp nhận tiền chuẩn, và bị thanh tra. Người chơi có hạn 1,5 ngày game để trả lời. Không trả lời trong hạn được tính là </w:t>
+        <w:t xml:space="preserve">Sứ giả đến làng người chơi cùng vài lính hộ tống, thông báo bá chủ đã ra đời, tiền chuẩn mới, và yêu cầu làng thần phục: nộp cống mỗi mùa, chấp nhận tiền chuẩn, và bị thanh tra. Người chơi có hạn 0,5 ngày game (10 phút thật) để trả lời, game tự lưu ngay trước khi hộp thoại hiện. Không trả lời trong hạn được tính là </w:t>
       </w:r>
       <w:r>
         <w:rPr>
@@ -7173,7 +7817,7 @@
           <w:sz w:val="22"/>
           <w:szCs w:val="22"/>
         </w:rPr>
-        <w:t xml:space="preserve"> (một lần): tốn một phần kho và chút uy tín, kéo hạn thêm 1 ngày.</w:t>
+        <w:t xml:space="preserve"> (một lần): tốn một phần kho và chút uy tín, kéo hạn thêm 0,25 ngày.</w:t>
       </w:r>
     </w:p>
     <w:p>
@@ -7330,7 +7974,7 @@
           <w:sz w:val="22"/>
           <w:szCs w:val="22"/>
         </w:rPr>
-        <w:t xml:space="preserve">: 15% sản lượng mỗi mùa (hàng và tiền), tăng 3 điểm phần trăm mỗi mùa tới trần 40%. Bá chủ thêm vào nếu thấy làng giàu lên.</w:t>
+        <w:t xml:space="preserve">: 15% sản lượng mỗi lần thu (hàng và tiền, thu mỗi 2 ngày game), tăng 3 điểm phần trăm mỗi 2 ngày game tới trần 40%. Bá chủ thêm vào nếu thấy làng giàu lên.</w:t>
       </w:r>
     </w:p>
     <w:p>
@@ -7390,7 +8034,7 @@
           <w:sz w:val="22"/>
           <w:szCs w:val="22"/>
         </w:rPr>
-        <w:t xml:space="preserve"> mỗi 5 ngày: bá chủ cử người kiểm tra quân số, kho và công trình. Mức cho phép: quân ≤ 6, kho không quá "mức nghèo", không có công trình lạ.</w:t>
+        <w:t xml:space="preserve"> mỗi 1,5 ngày game (30 phút thật): bá chủ cử người kiểm tra quân số, kho và công trình. Mức cho phép: quân ≤ 6, kho không quá "mức nghèo", không có công trình lạ.</w:t>
       </w:r>
     </w:p>
     <w:p>
@@ -8008,7 +8652,7 @@
           <w:sz w:val="22"/>
           <w:szCs w:val="22"/>
         </w:rPr>
-        <w:t xml:space="preserve"> mỗi chuyến đi: 10% cơ bản, +15% nếu làng đích có gián điệp của bá chủ, +5% cho mỗi sứ giả thêm, −10% nếu đi ban đêm, −10% nếu đi đường vòng (lâu hơn một ngày). Bị phát hiện lần đầu: cống ×2 và đòi con tin. Lần hai: chiến tranh.</w:t>
+        <w:t xml:space="preserve"> mỗi chuyến đi: 10% cơ bản, +15% nếu làng đích có gián điệp của bá chủ, +5% cho mỗi sứ giả thêm, −10% nếu đi ban đêm, −10% nếu đi đường vòng (lâu hơn nửa ngày). Bị phát hiện lần đầu: cống ×2 và đòi con tin. Lần hai: chiến tranh.</w:t>
       </w:r>
     </w:p>
     <w:p>
@@ -8038,7 +8682,7 @@
           <w:sz w:val="22"/>
           <w:szCs w:val="22"/>
         </w:rPr>
-        <w:t xml:space="preserve">: mỗi đồng minh định kỳ (khoảng 6 ngày) nhờ giúp một việc. Giúp thì Lòng tin tăng, bỏ qua thì giảm. Lòng tin dưới 20 thì họ rút; dưới 0 thì có xác suất tố cáo cho bá chủ.</w:t>
+        <w:t xml:space="preserve">: mỗi đồng minh định kỳ (khoảng 2 ngày game) nhờ giúp một việc. Giúp thì Lòng tin tăng, bỏ qua thì giảm. Lòng tin dưới 20 thì họ rút; dưới 0 thì có xác suất tố cáo cho bá chủ.</w:t>
       </w:r>
     </w:p>
     <w:p>
@@ -8204,7 +8848,7 @@
           <w:sz w:val="22"/>
           <w:szCs w:val="22"/>
         </w:rPr>
-        <w:t xml:space="preserve"> (sau 5, 10, 15 ngày kể từ lúc từ chối). Mỗi hạn bá chủ gửi một đạo quân thử sức. Quy mô gợi ý: 10, 20, 30 lính hiệu dụng; hạn ba có thêm đích thân đạo quân của vua.</w:t>
+        <w:t xml:space="preserve"> (sau 2, 4, 6 ngày game kể từ lúc từ chối). Mỗi hạn bá chủ gửi một đạo quân thử sức. Quy mô gợi ý: 10, 20, 30 lính hiệu dụng; hạn ba có thêm đích thân đạo quân của vua.</w:t>
       </w:r>
     </w:p>
     <w:p>
@@ -8289,7 +8933,7 @@
           <w:sz w:val="22"/>
           <w:szCs w:val="22"/>
         </w:rPr>
-        <w:t xml:space="preserve">Chiến tranh tổng lực: 3 đợt tấn công (khoảng 20, 35, 50 lính) vào ngày +2, +5, +9, cộng cấm vận.</w:t>
+        <w:t xml:space="preserve">Chiến tranh tổng lực: 3 đợt tấn công (khoảng 20, 35, 50 lính) vào ngày +1, +2, +4 sau khi giết sứ giả, cộng cấm vận.</w:t>
       </w:r>
     </w:p>
     <w:p>
@@ -9530,7 +10174,7 @@
           <w:sz w:val="22"/>
           <w:szCs w:val="22"/>
         </w:rPr>
-        <w:t xml:space="preserve">: sau 12–16 ngày, một chư hầu hoặc một làng khác đạt điều kiện xưng bá (như mục 5.1, nhưng so với người chơi), gửi sứ giả hoặc nổi dậy. Vòng lặp lại bắt đầu, và mỗi vòng mạnh hơn vòng trước.</w:t>
+        <w:t xml:space="preserve">: sau 6–8 ngày game, một chư hầu hoặc một làng khác đạt điều kiện xưng bá (như mục 5.1, nhưng so với người chơi), gửi sứ giả hoặc nổi dậy. Vòng lặp lại bắt đầu, và mỗi vòng mạnh hơn vòng trước.</w:t>
       </w:r>
     </w:p>
     <w:p>
@@ -9604,7 +10248,7 @@
           <w:sz w:val="22"/>
           <w:szCs w:val="22"/>
         </w:rPr>
-        <w:t xml:space="preserve">Giữ ngôi ít nhất một mùa (5 ngày) mà không có làng nào đạt điều kiện xưng bá.</w:t>
+        <w:t xml:space="preserve">Giữ ngôi ít nhất 3 ngày game mà không có làng nào đạt điều kiện xưng bá.</w:t>
       </w:r>
     </w:p>
     <w:p>
@@ -9902,7 +10546,7 @@
                 <w:sz w:val="19"/>
                 <w:szCs w:val="19"/>
               </w:rPr>
-              <w:t xml:space="preserve">Nhịp quyết định của làng NPC</w:t>
+              <w:t xml:space="preserve">Nhịp của làng NPC</w:t>
             </w:r>
           </w:p>
         </w:tc>
@@ -9935,7 +10579,7 @@
                 <w:sz w:val="19"/>
                 <w:szCs w:val="19"/>
               </w:rPr>
-              <w:t xml:space="preserve">Mỗi mùa (5 ngày)</w:t>
+              <w:t xml:space="preserve">Vòng nhỏ mỗi ngày, quyết định lớn mỗi 2 ngày</w:t>
             </w:r>
           </w:p>
         </w:tc>
@@ -9968,7 +10612,7 @@
                 <w:sz w:val="19"/>
                 <w:szCs w:val="19"/>
               </w:rPr>
-              <w:t xml:space="preserve">Cùng nhịp với thời tiết, mùa</w:t>
+              <w:t xml:space="preserve">Ngày game 20 phút thật</w:t>
             </w:r>
           </w:p>
         </w:tc>
@@ -10039,7 +10683,7 @@
                 <w:sz w:val="19"/>
                 <w:szCs w:val="19"/>
               </w:rPr>
-              <w:t xml:space="preserve">40 điểm</w:t>
+              <w:t xml:space="preserve">40 điểm, +4 × hệ số × vùng × q mỗi ngày</w:t>
             </w:r>
           </w:p>
         </w:tc>
@@ -10143,7 +10787,7 @@
                 <w:sz w:val="19"/>
                 <w:szCs w:val="19"/>
               </w:rPr>
-              <w:t xml:space="preserve">18 / 22 / 28</w:t>
+              <w:t xml:space="preserve">9 / 12 / 15</w:t>
             </w:r>
           </w:p>
         </w:tc>
@@ -10176,7 +10820,7 @@
                 <w:sz w:val="19"/>
                 <w:szCs w:val="19"/>
               </w:rPr>
-              <w:t xml:space="preserve">Mục 5.1</w:t>
+              <w:t xml:space="preserve">Mục 5.1 (phương án B)</w:t>
             </w:r>
           </w:p>
         </w:tc>
@@ -10455,7 +11099,7 @@
                 <w:sz w:val="19"/>
                 <w:szCs w:val="19"/>
               </w:rPr>
-              <w:t xml:space="preserve">3% / 1%</w:t>
+              <w:t xml:space="preserve">3% / 2%</w:t>
             </w:r>
           </w:p>
         </w:tc>
@@ -10526,7 +11170,7 @@
                 <w:sz w:val="19"/>
                 <w:szCs w:val="19"/>
               </w:rPr>
-              <w:t xml:space="preserve">Cống nạp ban đầu / tăng mỗi mùa / trần</w:t>
+              <w:t xml:space="preserve">Cống nạp ban đầu / tăng mỗi 2 ngày / trần</w:t>
             </w:r>
           </w:p>
         </w:tc>
@@ -10663,7 +11307,7 @@
                 <w:sz w:val="19"/>
                 <w:szCs w:val="19"/>
               </w:rPr>
-              <w:t xml:space="preserve">Mỗi 5 ngày</w:t>
+              <w:t xml:space="preserve">Mỗi 1,5 ngày</w:t>
             </w:r>
           </w:p>
         </w:tc>
@@ -10871,7 +11515,7 @@
                 <w:sz w:val="19"/>
                 <w:szCs w:val="19"/>
               </w:rPr>
-              <w:t xml:space="preserve">+5, +10, +15 ngày</w:t>
+              <w:t xml:space="preserve">+2, +4, +6 ngày</w:t>
             </w:r>
           </w:p>
         </w:tc>
@@ -11112,7 +11756,7 @@
                 <w:sz w:val="19"/>
                 <w:szCs w:val="19"/>
               </w:rPr>
-              <w:t xml:space="preserve">Có một mùa ân hạn</w:t>
+              <w:t xml:space="preserve">Ân hạn 2 ngày game</w:t>
             </w:r>
           </w:p>
         </w:tc>
@@ -11183,7 +11827,7 @@
                 <w:sz w:val="19"/>
                 <w:szCs w:val="19"/>
               </w:rPr>
-              <w:t xml:space="preserve">1,5 ngày game (6 phút thật)</w:t>
+              <w:t xml:space="preserve">0,5 ngày game (10 phút thật)</w:t>
             </w:r>
           </w:p>
         </w:tc>
@@ -11484,7 +12128,7 @@
                 <w:sz w:val="19"/>
                 <w:szCs w:val="19"/>
               </w:rPr>
-              <w:t xml:space="preserve">Test mô phỏng nhiều seed: bá chủ xuất hiện trong cửa sổ ngày 18–28, không có hai bá chủ cùng lúc, người chơi không bao giờ là bá chủ.</w:t>
+              <w:t xml:space="preserve">Test mô phỏng nhiều seed: bá chủ xuất hiện trong cửa sổ ngày 9–15, không có hai bá chủ cùng lúc, người chơi không bao giờ là bá chủ.</w:t>
             </w:r>
           </w:p>
         </w:tc>
@@ -12108,7 +12752,7 @@
                 <w:sz w:val="19"/>
                 <w:szCs w:val="19"/>
               </w:rPr>
-              <w:t xml:space="preserve">Test vòng lặp thứ hai bắt đầu sau 12–16 ngày; điều kiện mở cổng.</w:t>
+              <w:t xml:space="preserve">Test vòng lặp thứ hai bắt đầu sau 6–8 ngày game; điều kiện mở cổng.</w:t>
             </w:r>
           </w:p>
         </w:tc>
@@ -12121,7 +12765,8 @@
     </w:p>
     <w:p>
       <w:pPr>
-        <w:spacing w:after="120" w:line="300"/>
+        <w:pStyle w:val="Heading2"/>
+        <w:spacing w:after="100" w:before="240"/>
       </w:pPr>
       <w:r>
         <w:rPr>
@@ -12129,19 +12774,854 @@
           <w:b/>
           <w:bCs/>
           <w:color w:val="2B2118"/>
-          <w:sz w:val="22"/>
-          <w:szCs w:val="22"/>
-        </w:rPr>
-        <w:t xml:space="preserve">Về code hiện có.</w:t>
-      </w:r>
-      <w:r>
-        <w:rPr>
-          <w:rFonts w:ascii="Arial" w:cs="Arial" w:eastAsia="Arial" w:hAnsi="Arial"/>
-          <w:color w:val="2B2118"/>
-          <w:sz w:val="22"/>
-          <w:szCs w:val="22"/>
-        </w:rPr>
-        <w:t xml:space="preserve"> Phần mới nên nằm ở các module riêng (làng NPC, kinh tế, ngoại giao) thay vì chồng lên tribes.ts; tribes.ts sau này chỉ giữ phần đơn vị và chiến đấu. Số liệu (bậc, tỷ giá, hạn, trần) nằm trong tệp JSON giống weapons.json và research.json để chỉnh mà không sửa code. Mọi trạng thái mới (làng, ví, Nghi ngờ, Lòng tin, tin đồn) phải được thiết kế để lưu được, vì phần lưu game sẽ cần tới.</w:t>
+          <w:sz w:val="25"/>
+          <w:szCs w:val="25"/>
+        </w:rPr>
+        <w:t xml:space="preserve">11.1 Đặt vào kiến trúc hiện có</w:t>
+      </w:r>
+    </w:p>
+    <w:p>
+      <w:pPr>
+        <w:spacing w:after="120" w:line="300"/>
+      </w:pPr>
+      <w:r>
+        <w:rPr>
+          <w:rFonts w:ascii="Arial" w:cs="Arial" w:eastAsia="Arial" w:hAnsi="Arial"/>
+          <w:color w:val="2B2118"/>
+          <w:sz w:val="22"/>
+          <w:szCs w:val="22"/>
+        </w:rPr>
+        <w:t xml:space="preserve">Theo `src/sim/ARCHITECTURE.md`: hệ thống nhận `sim` làm tham số đầu, không import hệ thống khác (gọi qua `sim.tênHàm`), lớp dữ liệu không biết `Sim`, không tệp nào quá 650 dòng, mọi trạng thái mới nằm trong `Sim` và phải khai báo ở `SAVED` trong `save.ts`. Phần chính trị làm theo đúng khuôn đó:</w:t>
+      </w:r>
+    </w:p>
+    <w:tbl>
+      <w:tblPr>
+        <w:tblW w:type="dxa" w:w="9638"/>
+        <w:tblBorders>
+          <w:top w:val="single" w:color="auto" w:sz="4"/>
+          <w:left w:val="single" w:color="auto" w:sz="4"/>
+          <w:bottom w:val="single" w:color="auto" w:sz="4"/>
+          <w:right w:val="single" w:color="auto" w:sz="4"/>
+          <w:insideH w:val="single" w:color="auto" w:sz="4"/>
+          <w:insideV w:val="single" w:color="auto" w:sz="4"/>
+        </w:tblBorders>
+      </w:tblPr>
+      <w:tblGrid>
+        <w:gridCol w:w="2100"/>
+        <w:gridCol w:w="1800"/>
+        <w:gridCol w:w="5738"/>
+      </w:tblGrid>
+      <w:tr>
+        <w:trPr>
+          <w:tblHeader/>
+        </w:trPr>
+        <w:tc>
+          <w:tcPr>
+            <w:tcW w:type="dxa" w:w="2100"/>
+            <w:tcBorders>
+              <w:top w:val="single" w:color="C9B89C" w:sz="4"/>
+              <w:left w:val="single" w:color="C9B89C" w:sz="4"/>
+              <w:bottom w:val="single" w:color="C9B89C" w:sz="4"/>
+              <w:right w:val="single" w:color="C9B89C" w:sz="4"/>
+            </w:tcBorders>
+            <w:shd w:fill="EFE4D0" w:val="clear"/>
+            <w:tcMar>
+              <w:top w:type="dxa" w:w="70"/>
+              <w:left w:type="dxa" w:w="100"/>
+              <w:bottom w:type="dxa" w:w="70"/>
+              <w:right w:type="dxa" w:w="100"/>
+            </w:tcMar>
+          </w:tcPr>
+          <w:p>
+            <w:pPr>
+              <w:spacing w:after="20" w:line="260"/>
+            </w:pPr>
+            <w:r>
+              <w:rPr>
+                <w:rFonts w:ascii="Arial" w:cs="Arial" w:eastAsia="Arial" w:hAnsi="Arial"/>
+                <w:b/>
+                <w:bCs/>
+                <w:color w:val="2B2118"/>
+                <w:sz w:val="19"/>
+                <w:szCs w:val="19"/>
+              </w:rPr>
+              <w:t xml:space="preserve">Tệp mới</w:t>
+            </w:r>
+          </w:p>
+        </w:tc>
+        <w:tc>
+          <w:tcPr>
+            <w:tcW w:type="dxa" w:w="1800"/>
+            <w:tcBorders>
+              <w:top w:val="single" w:color="C9B89C" w:sz="4"/>
+              <w:left w:val="single" w:color="C9B89C" w:sz="4"/>
+              <w:bottom w:val="single" w:color="C9B89C" w:sz="4"/>
+              <w:right w:val="single" w:color="C9B89C" w:sz="4"/>
+            </w:tcBorders>
+            <w:shd w:fill="EFE4D0" w:val="clear"/>
+            <w:tcMar>
+              <w:top w:type="dxa" w:w="70"/>
+              <w:left w:type="dxa" w:w="100"/>
+              <w:bottom w:type="dxa" w:w="70"/>
+              <w:right w:type="dxa" w:w="100"/>
+            </w:tcMar>
+          </w:tcPr>
+          <w:p>
+            <w:pPr>
+              <w:spacing w:after="20" w:line="260"/>
+            </w:pPr>
+            <w:r>
+              <w:rPr>
+                <w:rFonts w:ascii="Arial" w:cs="Arial" w:eastAsia="Arial" w:hAnsi="Arial"/>
+                <w:b/>
+                <w:bCs/>
+                <w:color w:val="2B2118"/>
+                <w:sz w:val="19"/>
+                <w:szCs w:val="19"/>
+              </w:rPr>
+              <w:t xml:space="preserve">Lớp</w:t>
+            </w:r>
+          </w:p>
+        </w:tc>
+        <w:tc>
+          <w:tcPr>
+            <w:tcW w:type="dxa" w:w="5738"/>
+            <w:tcBorders>
+              <w:top w:val="single" w:color="C9B89C" w:sz="4"/>
+              <w:left w:val="single" w:color="C9B89C" w:sz="4"/>
+              <w:bottom w:val="single" w:color="C9B89C" w:sz="4"/>
+              <w:right w:val="single" w:color="C9B89C" w:sz="4"/>
+            </w:tcBorders>
+            <w:shd w:fill="EFE4D0" w:val="clear"/>
+            <w:tcMar>
+              <w:top w:type="dxa" w:w="70"/>
+              <w:left w:type="dxa" w:w="100"/>
+              <w:bottom w:type="dxa" w:w="70"/>
+              <w:right w:type="dxa" w:w="100"/>
+            </w:tcMar>
+          </w:tcPr>
+          <w:p>
+            <w:pPr>
+              <w:spacing w:after="20" w:line="260"/>
+            </w:pPr>
+            <w:r>
+              <w:rPr>
+                <w:rFonts w:ascii="Arial" w:cs="Arial" w:eastAsia="Arial" w:hAnsi="Arial"/>
+                <w:b/>
+                <w:bCs/>
+                <w:color w:val="2B2118"/>
+                <w:sz w:val="19"/>
+                <w:szCs w:val="19"/>
+              </w:rPr>
+              <w:t xml:space="preserve">Việc</w:t>
+            </w:r>
+          </w:p>
+        </w:tc>
+      </w:tr>
+      <w:tr>
+        <w:trPr>
+          <w:cantSplit/>
+        </w:trPr>
+        <w:tc>
+          <w:tcPr>
+            <w:tcW w:type="dxa" w:w="2100"/>
+            <w:tcBorders>
+              <w:top w:val="single" w:color="C9B89C" w:sz="4"/>
+              <w:left w:val="single" w:color="C9B89C" w:sz="4"/>
+              <w:bottom w:val="single" w:color="C9B89C" w:sz="4"/>
+              <w:right w:val="single" w:color="C9B89C" w:sz="4"/>
+            </w:tcBorders>
+            <w:tcMar>
+              <w:top w:type="dxa" w:w="70"/>
+              <w:left w:type="dxa" w:w="100"/>
+              <w:bottom w:type="dxa" w:w="70"/>
+              <w:right w:type="dxa" w:w="100"/>
+            </w:tcMar>
+          </w:tcPr>
+          <w:p>
+            <w:pPr>
+              <w:spacing w:after="20" w:line="260"/>
+            </w:pPr>
+            <w:r>
+              <w:rPr>
+                <w:rFonts w:ascii="Arial" w:cs="Arial" w:eastAsia="Arial" w:hAnsi="Arial"/>
+                <w:b w:val="false"/>
+                <w:bCs w:val="false"/>
+                <w:color w:val="2B2118"/>
+                <w:sz w:val="19"/>
+                <w:szCs w:val="19"/>
+              </w:rPr>
+              <w:t xml:space="preserve">`politics.ts`</w:t>
+            </w:r>
+          </w:p>
+        </w:tc>
+        <w:tc>
+          <w:tcPr>
+            <w:tcW w:type="dxa" w:w="1800"/>
+            <w:tcBorders>
+              <w:top w:val="single" w:color="C9B89C" w:sz="4"/>
+              <w:left w:val="single" w:color="C9B89C" w:sz="4"/>
+              <w:bottom w:val="single" w:color="C9B89C" w:sz="4"/>
+              <w:right w:val="single" w:color="C9B89C" w:sz="4"/>
+            </w:tcBorders>
+            <w:tcMar>
+              <w:top w:type="dxa" w:w="70"/>
+              <w:left w:type="dxa" w:w="100"/>
+              <w:bottom w:type="dxa" w:w="70"/>
+              <w:right w:type="dxa" w:w="100"/>
+            </w:tcMar>
+          </w:tcPr>
+          <w:p>
+            <w:pPr>
+              <w:spacing w:after="20" w:line="260"/>
+            </w:pPr>
+            <w:r>
+              <w:rPr>
+                <w:rFonts w:ascii="Arial" w:cs="Arial" w:eastAsia="Arial" w:hAnsi="Arial"/>
+                <w:b w:val="false"/>
+                <w:bCs w:val="false"/>
+                <w:color w:val="2B2118"/>
+                <w:sz w:val="19"/>
+                <w:szCs w:val="19"/>
+              </w:rPr>
+              <w:t xml:space="preserve">Dữ liệu và luật thuần</w:t>
+            </w:r>
+          </w:p>
+        </w:tc>
+        <w:tc>
+          <w:tcPr>
+            <w:tcW w:type="dxa" w:w="5738"/>
+            <w:tcBorders>
+              <w:top w:val="single" w:color="C9B89C" w:sz="4"/>
+              <w:left w:val="single" w:color="C9B89C" w:sz="4"/>
+              <w:bottom w:val="single" w:color="C9B89C" w:sz="4"/>
+              <w:right w:val="single" w:color="C9B89C" w:sz="4"/>
+            </w:tcBorders>
+            <w:tcMar>
+              <w:top w:type="dxa" w:w="70"/>
+              <w:left w:type="dxa" w:w="100"/>
+              <w:bottom w:type="dxa" w:w="70"/>
+              <w:right w:type="dxa" w:w="100"/>
+            </w:tcMar>
+          </w:tcPr>
+          <w:p>
+            <w:pPr>
+              <w:spacing w:after="20" w:line="260"/>
+            </w:pPr>
+            <w:r>
+              <w:rPr>
+                <w:rFonts w:ascii="Arial" w:cs="Arial" w:eastAsia="Arial" w:hAnsi="Arial"/>
+                <w:b w:val="false"/>
+                <w:bCs w:val="false"/>
+                <w:color w:val="2B2118"/>
+                <w:sz w:val="19"/>
+                <w:szCs w:val="19"/>
+              </w:rPr>
+              <w:t xml:space="preserve">Kiểu dữ liệu (Realm, Court, Rumor), công thức sức mạnh, tiến độ lên bậc, khoảng tỷ giá, điều kiện xưng bá. Hàm thuần, không biết Sim, dễ test và dễ dịch sang C#.</w:t>
+            </w:r>
+          </w:p>
+        </w:tc>
+      </w:tr>
+      <w:tr>
+        <w:trPr>
+          <w:cantSplit/>
+        </w:trPr>
+        <w:tc>
+          <w:tcPr>
+            <w:tcW w:type="dxa" w:w="2100"/>
+            <w:tcBorders>
+              <w:top w:val="single" w:color="C9B89C" w:sz="4"/>
+              <w:left w:val="single" w:color="C9B89C" w:sz="4"/>
+              <w:bottom w:val="single" w:color="C9B89C" w:sz="4"/>
+              <w:right w:val="single" w:color="C9B89C" w:sz="4"/>
+            </w:tcBorders>
+            <w:tcMar>
+              <w:top w:type="dxa" w:w="70"/>
+              <w:left w:type="dxa" w:w="100"/>
+              <w:bottom w:type="dxa" w:w="70"/>
+              <w:right w:type="dxa" w:w="100"/>
+            </w:tcMar>
+          </w:tcPr>
+          <w:p>
+            <w:pPr>
+              <w:spacing w:after="20" w:line="260"/>
+            </w:pPr>
+            <w:r>
+              <w:rPr>
+                <w:rFonts w:ascii="Arial" w:cs="Arial" w:eastAsia="Arial" w:hAnsi="Arial"/>
+                <w:b w:val="false"/>
+                <w:bCs w:val="false"/>
+                <w:color w:val="2B2118"/>
+                <w:sz w:val="19"/>
+                <w:szCs w:val="19"/>
+              </w:rPr>
+              <w:t xml:space="preserve">`realms.ts`</w:t>
+            </w:r>
+          </w:p>
+        </w:tc>
+        <w:tc>
+          <w:tcPr>
+            <w:tcW w:type="dxa" w:w="1800"/>
+            <w:tcBorders>
+              <w:top w:val="single" w:color="C9B89C" w:sz="4"/>
+              <w:left w:val="single" w:color="C9B89C" w:sz="4"/>
+              <w:bottom w:val="single" w:color="C9B89C" w:sz="4"/>
+              <w:right w:val="single" w:color="C9B89C" w:sz="4"/>
+            </w:tcBorders>
+            <w:tcMar>
+              <w:top w:type="dxa" w:w="70"/>
+              <w:left w:type="dxa" w:w="100"/>
+              <w:bottom w:type="dxa" w:w="70"/>
+              <w:right w:type="dxa" w:w="100"/>
+            </w:tcMar>
+          </w:tcPr>
+          <w:p>
+            <w:pPr>
+              <w:spacing w:after="20" w:line="260"/>
+            </w:pPr>
+            <w:r>
+              <w:rPr>
+                <w:rFonts w:ascii="Arial" w:cs="Arial" w:eastAsia="Arial" w:hAnsi="Arial"/>
+                <w:b w:val="false"/>
+                <w:bCs w:val="false"/>
+                <w:color w:val="2B2118"/>
+                <w:sz w:val="19"/>
+                <w:szCs w:val="19"/>
+              </w:rPr>
+              <w:t xml:space="preserve">Hệ thống sinh vật</w:t>
+            </w:r>
+          </w:p>
+        </w:tc>
+        <w:tc>
+          <w:tcPr>
+            <w:tcW w:type="dxa" w:w="5738"/>
+            <w:tcBorders>
+              <w:top w:val="single" w:color="C9B89C" w:sz="4"/>
+              <w:left w:val="single" w:color="C9B89C" w:sz="4"/>
+              <w:bottom w:val="single" w:color="C9B89C" w:sz="4"/>
+              <w:right w:val="single" w:color="C9B89C" w:sz="4"/>
+            </w:tcBorders>
+            <w:tcMar>
+              <w:top w:type="dxa" w:w="70"/>
+              <w:left w:type="dxa" w:w="100"/>
+              <w:bottom w:type="dxa" w:w="70"/>
+              <w:right w:type="dxa" w:w="100"/>
+            </w:tcMar>
+          </w:tcPr>
+          <w:p>
+            <w:pPr>
+              <w:spacing w:after="20" w:line="260"/>
+            </w:pPr>
+            <w:r>
+              <w:rPr>
+                <w:rFonts w:ascii="Arial" w:cs="Arial" w:eastAsia="Arial" w:hAnsi="Arial"/>
+                <w:b w:val="false"/>
+                <w:bCs w:val="false"/>
+                <w:color w:val="2B2118"/>
+                <w:sz w:val="19"/>
+                <w:szCs w:val="19"/>
+              </w:rPr>
+              <w:t xml:space="preserve">Mô phỏng các làng NPC mỗi ngày: sản xuất, ví, bậc, sai lầm thủ lĩnh, đổi bá chủ. Gắn mỗi làng với một bộ tộc trong `tribes.ts`; tribes.ts giữ đơn vị và chiến đấu, realms.ts giữ kinh tế và chính trị.</w:t>
+            </w:r>
+          </w:p>
+        </w:tc>
+      </w:tr>
+      <w:tr>
+        <w:trPr>
+          <w:cantSplit/>
+        </w:trPr>
+        <w:tc>
+          <w:tcPr>
+            <w:tcW w:type="dxa" w:w="2100"/>
+            <w:tcBorders>
+              <w:top w:val="single" w:color="C9B89C" w:sz="4"/>
+              <w:left w:val="single" w:color="C9B89C" w:sz="4"/>
+              <w:bottom w:val="single" w:color="C9B89C" w:sz="4"/>
+              <w:right w:val="single" w:color="C9B89C" w:sz="4"/>
+            </w:tcBorders>
+            <w:tcMar>
+              <w:top w:type="dxa" w:w="70"/>
+              <w:left w:type="dxa" w:w="100"/>
+              <w:bottom w:type="dxa" w:w="70"/>
+              <w:right w:type="dxa" w:w="100"/>
+            </w:tcMar>
+          </w:tcPr>
+          <w:p>
+            <w:pPr>
+              <w:spacing w:after="20" w:line="260"/>
+            </w:pPr>
+            <w:r>
+              <w:rPr>
+                <w:rFonts w:ascii="Arial" w:cs="Arial" w:eastAsia="Arial" w:hAnsi="Arial"/>
+                <w:b w:val="false"/>
+                <w:bCs w:val="false"/>
+                <w:color w:val="2B2118"/>
+                <w:sz w:val="19"/>
+                <w:szCs w:val="19"/>
+              </w:rPr>
+              <w:t xml:space="preserve">`markets.ts`</w:t>
+            </w:r>
+          </w:p>
+        </w:tc>
+        <w:tc>
+          <w:tcPr>
+            <w:tcW w:type="dxa" w:w="1800"/>
+            <w:tcBorders>
+              <w:top w:val="single" w:color="C9B89C" w:sz="4"/>
+              <w:left w:val="single" w:color="C9B89C" w:sz="4"/>
+              <w:bottom w:val="single" w:color="C9B89C" w:sz="4"/>
+              <w:right w:val="single" w:color="C9B89C" w:sz="4"/>
+            </w:tcBorders>
+            <w:tcMar>
+              <w:top w:type="dxa" w:w="70"/>
+              <w:left w:type="dxa" w:w="100"/>
+              <w:bottom w:type="dxa" w:w="70"/>
+              <w:right w:type="dxa" w:w="100"/>
+            </w:tcMar>
+          </w:tcPr>
+          <w:p>
+            <w:pPr>
+              <w:spacing w:after="20" w:line="260"/>
+            </w:pPr>
+            <w:r>
+              <w:rPr>
+                <w:rFonts w:ascii="Arial" w:cs="Arial" w:eastAsia="Arial" w:hAnsi="Arial"/>
+                <w:b w:val="false"/>
+                <w:bCs w:val="false"/>
+                <w:color w:val="2B2118"/>
+                <w:sz w:val="19"/>
+                <w:szCs w:val="19"/>
+              </w:rPr>
+              <w:t xml:space="preserve">Hệ thống làng</w:t>
+            </w:r>
+          </w:p>
+        </w:tc>
+        <w:tc>
+          <w:tcPr>
+            <w:tcW w:type="dxa" w:w="5738"/>
+            <w:tcBorders>
+              <w:top w:val="single" w:color="C9B89C" w:sz="4"/>
+              <w:left w:val="single" w:color="C9B89C" w:sz="4"/>
+              <w:bottom w:val="single" w:color="C9B89C" w:sz="4"/>
+              <w:right w:val="single" w:color="C9B89C" w:sz="4"/>
+            </w:tcBorders>
+            <w:tcMar>
+              <w:top w:type="dxa" w:w="70"/>
+              <w:left w:type="dxa" w:w="100"/>
+              <w:bottom w:type="dxa" w:w="70"/>
+              <w:right w:type="dxa" w:w="100"/>
+            </w:tcMar>
+          </w:tcPr>
+          <w:p>
+            <w:pPr>
+              <w:spacing w:after="20" w:line="260"/>
+            </w:pPr>
+            <w:r>
+              <w:rPr>
+                <w:rFonts w:ascii="Arial" w:cs="Arial" w:eastAsia="Arial" w:hAnsi="Arial"/>
+                <w:b w:val="false"/>
+                <w:bCs w:val="false"/>
+                <w:color w:val="2B2118"/>
+                <w:sz w:val="19"/>
+                <w:szCs w:val="19"/>
+              </w:rPr>
+              <w:t xml:space="preserve">Đổi chác với làng NPC: bảng giá, ví, giá giảm khi bán nhiều. Thay phần đổi chác cố định hiện ở `economy.ts`.</w:t>
+            </w:r>
+          </w:p>
+        </w:tc>
+      </w:tr>
+      <w:tr>
+        <w:trPr>
+          <w:cantSplit/>
+        </w:trPr>
+        <w:tc>
+          <w:tcPr>
+            <w:tcW w:type="dxa" w:w="2100"/>
+            <w:tcBorders>
+              <w:top w:val="single" w:color="C9B89C" w:sz="4"/>
+              <w:left w:val="single" w:color="C9B89C" w:sz="4"/>
+              <w:bottom w:val="single" w:color="C9B89C" w:sz="4"/>
+              <w:right w:val="single" w:color="C9B89C" w:sz="4"/>
+            </w:tcBorders>
+            <w:tcMar>
+              <w:top w:type="dxa" w:w="70"/>
+              <w:left w:type="dxa" w:w="100"/>
+              <w:bottom w:type="dxa" w:w="70"/>
+              <w:right w:type="dxa" w:w="100"/>
+            </w:tcMar>
+          </w:tcPr>
+          <w:p>
+            <w:pPr>
+              <w:spacing w:after="20" w:line="260"/>
+            </w:pPr>
+            <w:r>
+              <w:rPr>
+                <w:rFonts w:ascii="Arial" w:cs="Arial" w:eastAsia="Arial" w:hAnsi="Arial"/>
+                <w:b w:val="false"/>
+                <w:bCs w:val="false"/>
+                <w:color w:val="2B2118"/>
+                <w:sz w:val="19"/>
+                <w:szCs w:val="19"/>
+              </w:rPr>
+              <w:t xml:space="preserve">`diplomacy.ts`</w:t>
+            </w:r>
+          </w:p>
+        </w:tc>
+        <w:tc>
+          <w:tcPr>
+            <w:tcW w:type="dxa" w:w="1800"/>
+            <w:tcBorders>
+              <w:top w:val="single" w:color="C9B89C" w:sz="4"/>
+              <w:left w:val="single" w:color="C9B89C" w:sz="4"/>
+              <w:bottom w:val="single" w:color="C9B89C" w:sz="4"/>
+              <w:right w:val="single" w:color="C9B89C" w:sz="4"/>
+            </w:tcBorders>
+            <w:tcMar>
+              <w:top w:type="dxa" w:w="70"/>
+              <w:left w:type="dxa" w:w="100"/>
+              <w:bottom w:type="dxa" w:w="70"/>
+              <w:right w:type="dxa" w:w="100"/>
+            </w:tcMar>
+          </w:tcPr>
+          <w:p>
+            <w:pPr>
+              <w:spacing w:after="20" w:line="260"/>
+            </w:pPr>
+            <w:r>
+              <w:rPr>
+                <w:rFonts w:ascii="Arial" w:cs="Arial" w:eastAsia="Arial" w:hAnsi="Arial"/>
+                <w:b w:val="false"/>
+                <w:bCs w:val="false"/>
+                <w:color w:val="2B2118"/>
+                <w:sz w:val="19"/>
+                <w:szCs w:val="19"/>
+              </w:rPr>
+              <w:t xml:space="preserve">Hệ thống sinh vật</w:t>
+            </w:r>
+          </w:p>
+        </w:tc>
+        <w:tc>
+          <w:tcPr>
+            <w:tcW w:type="dxa" w:w="5738"/>
+            <w:tcBorders>
+              <w:top w:val="single" w:color="C9B89C" w:sz="4"/>
+              <w:left w:val="single" w:color="C9B89C" w:sz="4"/>
+              <w:bottom w:val="single" w:color="C9B89C" w:sz="4"/>
+              <w:right w:val="single" w:color="C9B89C" w:sz="4"/>
+            </w:tcBorders>
+            <w:tcMar>
+              <w:top w:type="dxa" w:w="70"/>
+              <w:left w:type="dxa" w:w="100"/>
+              <w:bottom w:type="dxa" w:w="70"/>
+              <w:right w:type="dxa" w:w="100"/>
+            </w:tcMar>
+          </w:tcPr>
+          <w:p>
+            <w:pPr>
+              <w:spacing w:after="20" w:line="260"/>
+            </w:pPr>
+            <w:r>
+              <w:rPr>
+                <w:rFonts w:ascii="Arial" w:cs="Arial" w:eastAsia="Arial" w:hAnsi="Arial"/>
+                <w:b w:val="false"/>
+                <w:bCs w:val="false"/>
+                <w:color w:val="2B2118"/>
+                <w:sz w:val="19"/>
+                <w:szCs w:val="19"/>
+              </w:rPr>
+              <w:t xml:space="preserve">Sứ giả, bốn lựa chọn, ba con đường, thanh Nghi ngờ, thanh tra, liên minh, ba hạn thử thách, vòng lặp triều đại.</w:t>
+            </w:r>
+          </w:p>
+        </w:tc>
+      </w:tr>
+      <w:tr>
+        <w:trPr>
+          <w:cantSplit/>
+        </w:trPr>
+        <w:tc>
+          <w:tcPr>
+            <w:tcW w:type="dxa" w:w="2100"/>
+            <w:tcBorders>
+              <w:top w:val="single" w:color="C9B89C" w:sz="4"/>
+              <w:left w:val="single" w:color="C9B89C" w:sz="4"/>
+              <w:bottom w:val="single" w:color="C9B89C" w:sz="4"/>
+              <w:right w:val="single" w:color="C9B89C" w:sz="4"/>
+            </w:tcBorders>
+            <w:tcMar>
+              <w:top w:type="dxa" w:w="70"/>
+              <w:left w:type="dxa" w:w="100"/>
+              <w:bottom w:type="dxa" w:w="70"/>
+              <w:right w:type="dxa" w:w="100"/>
+            </w:tcMar>
+          </w:tcPr>
+          <w:p>
+            <w:pPr>
+              <w:spacing w:after="20" w:line="260"/>
+            </w:pPr>
+            <w:r>
+              <w:rPr>
+                <w:rFonts w:ascii="Arial" w:cs="Arial" w:eastAsia="Arial" w:hAnsi="Arial"/>
+                <w:b w:val="false"/>
+                <w:bCs w:val="false"/>
+                <w:color w:val="2B2118"/>
+                <w:sz w:val="19"/>
+                <w:szCs w:val="19"/>
+              </w:rPr>
+              <w:t xml:space="preserve">`intel.ts`</w:t>
+            </w:r>
+          </w:p>
+        </w:tc>
+        <w:tc>
+          <w:tcPr>
+            <w:tcW w:type="dxa" w:w="1800"/>
+            <w:tcBorders>
+              <w:top w:val="single" w:color="C9B89C" w:sz="4"/>
+              <w:left w:val="single" w:color="C9B89C" w:sz="4"/>
+              <w:bottom w:val="single" w:color="C9B89C" w:sz="4"/>
+              <w:right w:val="single" w:color="C9B89C" w:sz="4"/>
+            </w:tcBorders>
+            <w:tcMar>
+              <w:top w:type="dxa" w:w="70"/>
+              <w:left w:type="dxa" w:w="100"/>
+              <w:bottom w:type="dxa" w:w="70"/>
+              <w:right w:type="dxa" w:w="100"/>
+            </w:tcMar>
+          </w:tcPr>
+          <w:p>
+            <w:pPr>
+              <w:spacing w:after="20" w:line="260"/>
+            </w:pPr>
+            <w:r>
+              <w:rPr>
+                <w:rFonts w:ascii="Arial" w:cs="Arial" w:eastAsia="Arial" w:hAnsi="Arial"/>
+                <w:b w:val="false"/>
+                <w:bCs w:val="false"/>
+                <w:color w:val="2B2118"/>
+                <w:sz w:val="19"/>
+                <w:szCs w:val="19"/>
+              </w:rPr>
+              <w:t xml:space="preserve">Hệ thống làng</w:t>
+            </w:r>
+          </w:p>
+        </w:tc>
+        <w:tc>
+          <w:tcPr>
+            <w:tcW w:type="dxa" w:w="5738"/>
+            <w:tcBorders>
+              <w:top w:val="single" w:color="C9B89C" w:sz="4"/>
+              <w:left w:val="single" w:color="C9B89C" w:sz="4"/>
+              <w:bottom w:val="single" w:color="C9B89C" w:sz="4"/>
+              <w:right w:val="single" w:color="C9B89C" w:sz="4"/>
+            </w:tcBorders>
+            <w:tcMar>
+              <w:top w:type="dxa" w:w="70"/>
+              <w:left w:type="dxa" w:w="100"/>
+              <w:bottom w:type="dxa" w:w="70"/>
+              <w:right w:type="dxa" w:w="100"/>
+            </w:tcMar>
+          </w:tcPr>
+          <w:p>
+            <w:pPr>
+              <w:spacing w:after="20" w:line="260"/>
+            </w:pPr>
+            <w:r>
+              <w:rPr>
+                <w:rFonts w:ascii="Arial" w:cs="Arial" w:eastAsia="Arial" w:hAnsi="Arial"/>
+                <w:b w:val="false"/>
+                <w:bCs w:val="false"/>
+                <w:color w:val="2B2118"/>
+                <w:sz w:val="19"/>
+                <w:szCs w:val="19"/>
+              </w:rPr>
+              <w:t xml:space="preserve">Tin đồn, kiểm chứng, tâm trạng dân, gián điệp, nợ ân.</w:t>
+            </w:r>
+          </w:p>
+        </w:tc>
+      </w:tr>
+    </w:tbl>
+    <w:p>
+      <w:pPr>
+        <w:spacing w:after="100"/>
+      </w:pPr>
+    </w:p>
+    <w:p>
+      <w:pPr>
+        <w:pStyle w:val="ListParagraph"/>
+        <w:numPr>
+          <w:ilvl w:val="0"/>
+          <w:numId w:val="2"/>
+        </w:numPr>
+        <w:spacing w:after="70" w:line="290"/>
+      </w:pPr>
+      <w:r>
+        <w:rPr>
+          <w:rFonts w:ascii="Arial" w:cs="Arial" w:eastAsia="Arial" w:hAnsi="Arial"/>
+          <w:b/>
+          <w:bCs/>
+          <w:color w:val="2B2118"/>
+          <w:sz w:val="22"/>
+          <w:szCs w:val="22"/>
+        </w:rPr>
+        <w:t xml:space="preserve">Số liệu</w:t>
+      </w:r>
+      <w:r>
+        <w:rPr>
+          <w:rFonts w:ascii="Arial" w:cs="Arial" w:eastAsia="Arial" w:hAnsi="Arial"/>
+          <w:color w:val="2B2118"/>
+          <w:sz w:val="22"/>
+          <w:szCs w:val="22"/>
+        </w:rPr>
+        <w:t xml:space="preserve"> nằm ở `src/data/realms.json` (bậc, hệ số, điều kiện xưng bá, vật làm tiền) và `src/data/diplomacy.json` (con đường, hạn, ngưỡng Nghi ngờ, mẫu tin đồn, tình huống). Chỉnh cân bằng không cần sửa code.</w:t>
+      </w:r>
+    </w:p>
+    <w:p>
+      <w:pPr>
+        <w:pStyle w:val="ListParagraph"/>
+        <w:numPr>
+          <w:ilvl w:val="0"/>
+          <w:numId w:val="2"/>
+        </w:numPr>
+        <w:spacing w:after="70" w:line="290"/>
+      </w:pPr>
+      <w:r>
+        <w:rPr>
+          <w:rFonts w:ascii="Arial" w:cs="Arial" w:eastAsia="Arial" w:hAnsi="Arial"/>
+          <w:b/>
+          <w:bCs/>
+          <w:color w:val="2B2118"/>
+          <w:sz w:val="22"/>
+          <w:szCs w:val="22"/>
+        </w:rPr>
+        <w:t xml:space="preserve">Trạng thái mới</w:t>
+      </w:r>
+      <w:r>
+        <w:rPr>
+          <w:rFonts w:ascii="Arial" w:cs="Arial" w:eastAsia="Arial" w:hAnsi="Arial"/>
+          <w:color w:val="2B2118"/>
+          <w:sz w:val="22"/>
+          <w:szCs w:val="22"/>
+        </w:rPr>
+        <w:t xml:space="preserve"> (`realms`, `court`) là trường của `Sim`, ghi vào `SAVED`; tăng `SAVE_VERSION` và thêm hàm nâng cấp bản lưu cũ. Test "mọi trường của Sim đều được lưu" và test lưu rồi chạy tiếp phải ra đúng từng byte vẫn phải xanh.</w:t>
+      </w:r>
+    </w:p>
+    <w:p>
+      <w:pPr>
+        <w:pStyle w:val="ListParagraph"/>
+        <w:numPr>
+          <w:ilvl w:val="0"/>
+          <w:numId w:val="2"/>
+        </w:numPr>
+        <w:spacing w:after="70" w:line="290"/>
+      </w:pPr>
+      <w:r>
+        <w:rPr>
+          <w:rFonts w:ascii="Arial" w:cs="Arial" w:eastAsia="Arial" w:hAnsi="Arial"/>
+          <w:b/>
+          <w:bCs/>
+          <w:color w:val="2B2118"/>
+          <w:sz w:val="22"/>
+          <w:szCs w:val="22"/>
+        </w:rPr>
+        <w:t xml:space="preserve">Số ngẫu nhiên</w:t>
+      </w:r>
+      <w:r>
+        <w:rPr>
+          <w:rFonts w:ascii="Arial" w:cs="Arial" w:eastAsia="Arial" w:hAnsi="Arial"/>
+          <w:color w:val="2B2118"/>
+          <w:sz w:val="22"/>
+          <w:szCs w:val="22"/>
+        </w:rPr>
+        <w:t xml:space="preserve">: thêm một dòng riêng của Sim (ví dụ `sim.prnd`), đọc và đặt lại được như `Rng`, để chỉ số dân và các luồng hiện có không đổi. Không tạo bộ sinh riêng trong hệ thống.</w:t>
+      </w:r>
+    </w:p>
+    <w:p>
+      <w:pPr>
+        <w:pStyle w:val="ListParagraph"/>
+        <w:numPr>
+          <w:ilvl w:val="0"/>
+          <w:numId w:val="2"/>
+        </w:numPr>
+        <w:spacing w:after="70" w:line="290"/>
+      </w:pPr>
+      <w:r>
+        <w:rPr>
+          <w:rFonts w:ascii="Arial" w:cs="Arial" w:eastAsia="Arial" w:hAnsi="Arial"/>
+          <w:b/>
+          <w:bCs/>
+          <w:color w:val="2B2118"/>
+          <w:sz w:val="22"/>
+          <w:szCs w:val="22"/>
+        </w:rPr>
+        <w:t xml:space="preserve">Giao diện</w:t>
+      </w:r>
+      <w:r>
+        <w:rPr>
+          <w:rFonts w:ascii="Arial" w:cs="Arial" w:eastAsia="Arial" w:hAnsi="Arial"/>
+          <w:color w:val="2B2118"/>
+          <w:sz w:val="22"/>
+          <w:szCs w:val="22"/>
+        </w:rPr>
+        <w:t xml:space="preserve"> chỉ gọi `Sim` qua các hàm chuyển tiếp (`sim.answerEnvoy(...)`, `sim.realmsView()`); hộp thoại sứ giả dùng lại khung xác nhận đã có; thêm bảng so sánh các làng ở menu.</w:t>
+      </w:r>
+    </w:p>
+    <w:p>
+      <w:pPr>
+        <w:pStyle w:val="ListParagraph"/>
+        <w:numPr>
+          <w:ilvl w:val="0"/>
+          <w:numId w:val="2"/>
+        </w:numPr>
+        <w:spacing w:after="70" w:line="290"/>
+      </w:pPr>
+      <w:r>
+        <w:rPr>
+          <w:rFonts w:ascii="Arial" w:cs="Arial" w:eastAsia="Arial" w:hAnsi="Arial"/>
+          <w:b/>
+          <w:bCs/>
+          <w:color w:val="2B2118"/>
+          <w:sz w:val="22"/>
+          <w:szCs w:val="22"/>
+        </w:rPr>
+        <w:t xml:space="preserve">Công cụ Dev</w:t>
+      </w:r>
+      <w:r>
+        <w:rPr>
+          <w:rFonts w:ascii="Arial" w:cs="Arial" w:eastAsia="Arial" w:hAnsi="Arial"/>
+          <w:color w:val="2B2118"/>
+          <w:sz w:val="22"/>
+          <w:szCs w:val="22"/>
+        </w:rPr>
+        <w:t xml:space="preserve"> cho từng bước (bắt buộc để thử mà không phải chơi hàng giờ): ép một làng lên bậc Mạnh, xưng bá ngay, gọi sứ giả, đặt Nghi ngờ hay Lòng tin, tua tới hạn thử thách, đổi chuẩn tiền.</w:t>
+      </w:r>
+    </w:p>
+    <w:p>
+      <w:pPr>
+        <w:pStyle w:val="ListParagraph"/>
+        <w:numPr>
+          <w:ilvl w:val="0"/>
+          <w:numId w:val="2"/>
+        </w:numPr>
+        <w:spacing w:after="70" w:line="290"/>
+      </w:pPr>
+      <w:r>
+        <w:rPr>
+          <w:rFonts w:ascii="Arial" w:cs="Arial" w:eastAsia="Arial" w:hAnsi="Arial"/>
+          <w:b/>
+          <w:bCs/>
+          <w:color w:val="2B2118"/>
+          <w:sz w:val="22"/>
+          <w:szCs w:val="22"/>
+        </w:rPr>
+        <w:t xml:space="preserve">Kiểm tra kiến trúc</w:t>
+      </w:r>
+      <w:r>
+        <w:rPr>
+          <w:rFonts w:ascii="Arial" w:cs="Arial" w:eastAsia="Arial" w:hAnsi="Arial"/>
+          <w:color w:val="2B2118"/>
+          <w:sz w:val="22"/>
+          <w:szCs w:val="22"/>
+        </w:rPr>
+        <w:t xml:space="preserve">: khai báo từng tệp mới trong `test/architecture.cjs` và bảng của `ARCHITECTURE.md`; `npm run test:arch` phải xanh.</w:t>
       </w:r>
     </w:p>
     <w:p>
@@ -12182,16 +13662,16 @@
           <w:sz w:val="22"/>
           <w:szCs w:val="22"/>
         </w:rPr>
-        <w:t xml:space="preserve">Thời lượng</w:t>
-      </w:r>
-      <w:r>
-        <w:rPr>
-          <w:rFonts w:ascii="Arial" w:cs="Arial" w:eastAsia="Arial" w:hAnsi="Arial"/>
-          <w:color w:val="2B2118"/>
-          <w:sz w:val="22"/>
-          <w:szCs w:val="22"/>
-        </w:rPr>
-        <w:t xml:space="preserve">: kéo dài thời đại tới ngày 45–55, rút ngắn, hay tách hai phiên? (mục 5.2)</w:t>
+        <w:t xml:space="preserve">Thời gian</w:t>
+      </w:r>
+      <w:r>
+        <w:rPr>
+          <w:rFonts w:ascii="Arial" w:cs="Arial" w:eastAsia="Arial" w:hAnsi="Arial"/>
+          <w:color w:val="2B2118"/>
+          <w:sz w:val="22"/>
+          <w:szCs w:val="22"/>
+        </w:rPr>
+        <w:t xml:space="preserve">: giữ ngày game 20 phút và nén lịch chính trị (phương án B, mặc định), giữ lịch cũ (A), hay đưa ngày về 4 phút (C)? (mục 5.2)</w:t>
       </w:r>
     </w:p>
     <w:p>

</xml_diff>

<commit_message>
Design docs: record the nine decisions in the politics doc; new combat and defence design doc
Co-Authored-By: Claude Sonnet 5.5 <noreply@anthropic.com>
Claude-Session: https://claude.ai/code/session_01CPseNWvz5BjVLLrGyyTBid
</commit_message>
<xml_diff>
--- a/doc/Cơ chế kinh tế, chính trị, xã hội thời đồ đá.docx
+++ b/doc/Cơ chế kinh tế, chính trị, xã hội thời đồ đá.docx
@@ -29,7 +29,7 @@
           <w:sz w:val="20"/>
           <w:szCs w:val="20"/>
         </w:rPr>
-        <w:t xml:space="preserve">Bản thảo thiết kế · soạn cùng @Huy · Oct 28, 2026</w:t>
+        <w:t xml:space="preserve">Bản thảo thiết kế · soạn cùng @Huy · cập nhật Oct 28, 2026 (đã chốt 9 quyết định ở mục 12)</w:t>
       </w:r>
     </w:p>
     <w:p>
@@ -68,7 +68,7 @@
           <w:sz w:val="21"/>
           <w:szCs w:val="21"/>
         </w:rPr>
-        <w:t xml:space="preserve"> Một ngày game hiện dài 20 phút thật (`DAY_LENGTH` = 1200 giây), một mùa 5 ngày (100 phút), một năm 20 ngày. Mọi mốc trong tài liệu ghi bằng ngày game, kèm quy đổi ra phút thật ở mục 5. Mọi con số là đề xuất ban đầu để chơi thử và cân bằng lại, không phải giá trị cuối. Phần "Ý kiến của tôi" và "Câu hỏi cần bạn quyết" ở cuối là chỗ cần hai bên cùng chốt.</w:t>
+        <w:t xml:space="preserve"> Một ngày game hiện dài 20 phút thật (`DAY_LENGTH` = 1200 giây), một mùa 5 ngày (100 phút), một năm 20 ngày. Mọi mốc trong tài liệu ghi bằng ngày game, kèm quy đổi ra phút thật ở mục 5. Mọi con số là đề xuất ban đầu để chơi thử và cân bằng lại, không phải giá trị cuối. Mục 12 ghi các quyết định đã chốt và những điểm còn mở.</w:t>
       </w:r>
     </w:p>
     <w:p>
@@ -597,7 +597,7 @@
                 <w:sz w:val="19"/>
                 <w:szCs w:val="19"/>
               </w:rPr>
-              <w:t xml:space="preserve">Thua theo bậc: có thanh Nghi ngờ nhìn thấy được (hơi mờ), ba mức cảnh báo, và chỉ mức cuối mới mất game. Cho người chơi cơ hội sửa sai.</w:t>
+              <w:t xml:space="preserve">Thua theo bậc: Nghi ngờ là chỉ số ẩn, người chơi nhận gợi ý bằng lời và ba mức cảnh báo, chỉ mức cuối mới thua. "Thua" nghĩa là quay về điểm lưu lúc sứ giả của vòng này đến, không mất cả ván.</w:t>
             </w:r>
           </w:p>
         </w:tc>
@@ -1161,7 +1161,7 @@
           <w:sz w:val="22"/>
           <w:szCs w:val="22"/>
         </w:rPr>
-        <w:t xml:space="preserve"> Sai lầm làm mất của cải, đất, bạn bè trước, rồi mới mất game.</w:t>
+        <w:t xml:space="preserve"> Sai lầm làm mất của cải, đất, bạn bè trước, rồi mới thua. Thua là quay về lúc sứ giả của vòng lặp hiện tại đến (game tự lưu ngay trước đó), nên người chơi học được từ sai lầm mà không mất cả ván.</w:t>
       </w:r>
     </w:p>
     <w:p>
@@ -1255,7 +1255,27 @@
           <w:sz w:val="22"/>
           <w:szCs w:val="22"/>
         </w:rPr>
-        <w:t xml:space="preserve">Sáu tộc trong tài liệu thiết kế (Suối Nguồn, Rìu Đá, Đầm Lầy, Săn Mamut, Núi Tuyết, Thợ Đồng) trở thành sáu làng NPC. Game hiện mới có ba; phần mô phỏng viết sao cho thêm làng chỉ là thêm dữ liệu.</w:t>
+        <w:t xml:space="preserve">Sáu tộc trong tài liệu thiết kế (Suối Nguồn, Rìu Đá, Đầm Lầy, Săn Mamut, Núi Tuyết, Thợ Đồng) trở thành sáu làng NPC. </w:t>
+      </w:r>
+      <w:r>
+        <w:rPr>
+          <w:rFonts w:ascii="Arial" w:cs="Arial" w:eastAsia="Arial" w:hAnsi="Arial"/>
+          <w:b/>
+          <w:bCs/>
+          <w:color w:val="2B2118"/>
+          <w:sz w:val="22"/>
+          <w:szCs w:val="22"/>
+        </w:rPr>
+        <w:t xml:space="preserve">Vòng thử đầu tiên chỉ dùng 3 làng hiện có</w:t>
+      </w:r>
+      <w:r>
+        <w:rPr>
+          <w:rFonts w:ascii="Arial" w:cs="Arial" w:eastAsia="Arial" w:hAnsi="Arial"/>
+          <w:color w:val="2B2118"/>
+          <w:sz w:val="22"/>
+          <w:szCs w:val="22"/>
+        </w:rPr>
+        <w:t xml:space="preserve"> (Suối Nguồn, Rìu Đá, Đầm Lầy); bá chủ sẽ là một trong ba, chọn ngẫu nhiên theo tăng trưởng. Phần mô phỏng viết sao cho thêm ba làng sau chỉ là thêm dữ liệu.</w:t>
       </w:r>
     </w:p>
     <w:p>
@@ -6931,31 +6951,22 @@
       <w:r>
         <w:rPr>
           <w:rFonts w:ascii="Arial" w:cs="Arial" w:eastAsia="Arial" w:hAnsi="Arial"/>
-          <w:color w:val="2B2118"/>
-          <w:sz w:val="22"/>
-          <w:szCs w:val="22"/>
-        </w:rPr>
-        <w:t xml:space="preserve">Tôi chọn </w:t>
-      </w:r>
-      <w:r>
-        <w:rPr>
-          <w:rFonts w:ascii="Arial" w:cs="Arial" w:eastAsia="Arial" w:hAnsi="Arial"/>
           <w:b/>
           <w:bCs/>
           <w:color w:val="2B2118"/>
           <w:sz w:val="22"/>
           <w:szCs w:val="22"/>
         </w:rPr>
-        <w:t xml:space="preserve">B</w:t>
-      </w:r>
-      <w:r>
-        <w:rPr>
-          <w:rFonts w:ascii="Arial" w:cs="Arial" w:eastAsia="Arial" w:hAnsi="Arial"/>
-          <w:color w:val="2B2118"/>
-          <w:sz w:val="22"/>
-          <w:szCs w:val="22"/>
-        </w:rPr>
-        <w:t xml:space="preserve"> làm mặc định cho các con số trong tài liệu này. Hệ thống lưu game đã có (tự lưu đầu mỗi ngày, tiếp tục ván cũ) nên phiên chơi có thể ngắt ở những chỗ tự nhiên: ngay trước khi sứ giả đến, sau khi chọn con đường, và trước khi Dựng cờ hoặc hạn thử thách cuối. Nếu chọn A hay C thì mọi hạn và tốc độ ở mục 3, 4, 7 và 10 nhân hoặc chia theo tỷ lệ.</w:t>
+        <w:t xml:space="preserve">Đã chốt phương án B</w:t>
+      </w:r>
+      <w:r>
+        <w:rPr>
+          <w:rFonts w:ascii="Arial" w:cs="Arial" w:eastAsia="Arial" w:hAnsi="Arial"/>
+          <w:color w:val="2B2118"/>
+          <w:sz w:val="22"/>
+          <w:szCs w:val="22"/>
+        </w:rPr>
+        <w:t xml:space="preserve"> cho các con số trong tài liệu này. Hệ thống lưu game đã có (tự lưu đầu mỗi ngày, tiếp tục ván cũ) nên phiên chơi có thể ngắt ở những chỗ tự nhiên: ngay trước khi sứ giả đến, sau khi chọn con đường, và trước khi Dựng cờ hoặc hạn thử thách cuối. Nếu chọn A hay C thì mọi hạn và tốc độ ở mục 3, 4, 7 và 10 nhân hoặc chia theo tỷ lệ.</w:t>
       </w:r>
     </w:p>
     <w:p>
@@ -8085,16 +8096,16 @@
           <w:sz w:val="22"/>
           <w:szCs w:val="22"/>
         </w:rPr>
-        <w:t xml:space="preserve">Thanh Nghi ngờ (0–100)</w:t>
-      </w:r>
-      <w:r>
-        <w:rPr>
-          <w:rFonts w:ascii="Arial" w:cs="Arial" w:eastAsia="Arial" w:hAnsi="Arial"/>
-          <w:color w:val="2B2118"/>
-          <w:sz w:val="22"/>
-          <w:szCs w:val="22"/>
-        </w:rPr>
-        <w:t xml:space="preserve">, hiện cho người chơi nhưng hơi mờ (±10). Tăng khi vi phạm mức cho phép hoặc liên lạc với làng khác; giảm khi tuân thủ, biếu quà, gửi con tin.</w:t>
+        <w:t xml:space="preserve">Nghi ngờ (0–100) là chỉ số ẩn.</w:t>
+      </w:r>
+      <w:r>
+        <w:rPr>
+          <w:rFonts w:ascii="Arial" w:cs="Arial" w:eastAsia="Arial" w:hAnsi="Arial"/>
+          <w:color w:val="2B2118"/>
+          <w:sz w:val="22"/>
+          <w:szCs w:val="22"/>
+        </w:rPr>
+        <w:t xml:space="preserve"> Người chơi không thấy thanh nào, chỉ nhận gợi ý bằng lời ("thanh tra viên nhìn kho lâu hơn mọi lần") và tự tìm bằng chứng: cử người dò la, hỏi đồng minh, mua chuộc người của bá chủ. Bằng chứng tìm được có khoảng 20% là sai hoặc nhiễu. Nghi ngờ tăng khi vi phạm mức cho phép hoặc liên lạc với làng khác; giảm khi tuân thủ, biếu quà, gửi con tin.</w:t>
       </w:r>
     </w:p>
     <w:tbl>
@@ -8528,7 +8539,7 @@
                 <w:sz w:val="19"/>
                 <w:szCs w:val="19"/>
               </w:rPr>
-              <w:t xml:space="preserve">Mất tư cách chư hầu: bá chủ tấn công, chiếm kho. Đây là mức thua game.</w:t>
+              <w:t xml:space="preserve">Mất tư cách chư hầu: bá chủ tấn công, chiếm kho. Đây là mức thua: quay về điểm lưu lúc sứ giả đến.</w:t>
             </w:r>
           </w:p>
         </w:tc>
@@ -8952,7 +8963,7 @@
           <w:sz w:val="22"/>
           <w:szCs w:val="22"/>
         </w:rPr>
-        <w:t xml:space="preserve">Về thực chất là con đường khó nhất của C. Nếu người chơi đã chuẩn bị rất kỹ trước đó thì vẫn có đường sống; hộp thoại nên nói thẳng rằng gần như chắc chắn thua.</w:t>
+        <w:t xml:space="preserve">Về thực chất là con đường khó nhất của C. Vẫn có đường sống nhưng tỷ lệ rất thấp (khoảng 5–10% với người chơi chuẩn bị thường): chỉ khi chiến thuật rất hay (bẫy, địa hình, đồng minh có sẵn, hạ nhanh các đạo quân từng đợt) mới sống. Hộp thoại nói thẳng rằng gần như chắc chắn thua.</w:t>
       </w:r>
     </w:p>
     <w:p>
@@ -9660,7 +9671,7 @@
           <w:sz w:val="22"/>
           <w:szCs w:val="22"/>
         </w:rPr>
-        <w:t xml:space="preserve"> (ví dụ 70%). Ví dụ: "Làng X định bán đứng bạn", "Bá chủ sắp tăng cống", "Làng Y đang yếu đi". Người chơi chọn tin hay không tin, hoặc kiểm chứng bằng cách cử trinh sát hoặc hỏi một đồng minh (tốn thời gian và có rủi ro bại lộ). Tin sai làm lòng tin lung lay; tin đúng bị bỏ qua gây thiệt hại thật. Đây là nơi NPC tốt vẫn có thể bị người chơi nghi oan.</w:t>
+        <w:t xml:space="preserve"> (ví dụ 70%). Ví dụ: "Làng X định bán đứng bạn", "Bá chủ sắp tăng cống", "Làng Y đang yếu đi". Người chơi chọn tin hay không tin, hoặc kiểm chứng bằng cách cử trinh sát hoặc hỏi một đồng minh (tốn thời gian và có rủi ro bại lộ). Bản thân việc kiểm chứng cũng có thể sai, nên không có cách nào chắc chắn tuyệt đối. Tin sai làm lòng tin lung lay; tin đúng bị bỏ qua gây thiệt hại thật. Đây là nơi NPC tốt vẫn có thể bị người chơi nghi oan.</w:t>
       </w:r>
     </w:p>
     <w:p>
@@ -12407,7 +12418,7 @@
                 <w:sz w:val="19"/>
                 <w:szCs w:val="19"/>
               </w:rPr>
-              <w:t xml:space="preserve">Con đường A (thần phục): cống nạp, thanh tra, thanh Nghi ngờ, kho giấu.</w:t>
+              <w:t xml:space="preserve">Con đường A (thần phục): cống nạp, thanh tra, chỉ số Nghi ngờ (ẩn), kho giấu.</w:t>
             </w:r>
           </w:p>
         </w:tc>
@@ -13329,7 +13340,7 @@
                 <w:sz w:val="19"/>
                 <w:szCs w:val="19"/>
               </w:rPr>
-              <w:t xml:space="preserve">Sứ giả, bốn lựa chọn, ba con đường, thanh Nghi ngờ, thanh tra, liên minh, ba hạn thử thách, vòng lặp triều đại.</w:t>
+              <w:t xml:space="preserve">Sứ giả, bốn lựa chọn, ba con đường, chỉ số Nghi ngờ (ẩn), thanh tra, liên minh, ba hạn thử thách, vòng lặp triều đại.</w:t>
             </w:r>
           </w:p>
         </w:tc>
@@ -13612,6 +13623,36 @@
           <w:sz w:val="22"/>
           <w:szCs w:val="22"/>
         </w:rPr>
+        <w:t xml:space="preserve">Điểm quay lại</w:t>
+      </w:r>
+      <w:r>
+        <w:rPr>
+          <w:rFonts w:ascii="Arial" w:cs="Arial" w:eastAsia="Arial" w:hAnsi="Arial"/>
+          <w:color w:val="2B2118"/>
+          <w:sz w:val="22"/>
+          <w:szCs w:val="22"/>
+        </w:rPr>
+        <w:t xml:space="preserve">: ngay trước hộp thoại sứ giả của mỗi vòng, `Session` ghi một bản lưu riêng (không bị tự lưu đầu ngày ghi đè). Thua nghĩa là tải lại bản đó; giữ hai bản gần nhất.</w:t>
+      </w:r>
+    </w:p>
+    <w:p>
+      <w:pPr>
+        <w:pStyle w:val="ListParagraph"/>
+        <w:numPr>
+          <w:ilvl w:val="0"/>
+          <w:numId w:val="2"/>
+        </w:numPr>
+        <w:spacing w:after="70" w:line="290"/>
+      </w:pPr>
+      <w:r>
+        <w:rPr>
+          <w:rFonts w:ascii="Arial" w:cs="Arial" w:eastAsia="Arial" w:hAnsi="Arial"/>
+          <w:b/>
+          <w:bCs/>
+          <w:color w:val="2B2118"/>
+          <w:sz w:val="22"/>
+          <w:szCs w:val="22"/>
+        </w:rPr>
         <w:t xml:space="preserve">Kiểm tra kiến trúc</w:t>
       </w:r>
       <w:r>
@@ -13641,7 +13682,1090 @@
           <w:sz w:val="30"/>
           <w:szCs w:val="30"/>
         </w:rPr>
-        <w:t xml:space="preserve">12. Câu hỏi cần bạn quyết</w:t>
+        <w:t xml:space="preserve">12. Các quyết định đã chốt (28/10)</w:t>
+      </w:r>
+    </w:p>
+    <w:tbl>
+      <w:tblPr>
+        <w:tblW w:type="dxa" w:w="9638"/>
+        <w:tblBorders>
+          <w:top w:val="single" w:color="auto" w:sz="4"/>
+          <w:left w:val="single" w:color="auto" w:sz="4"/>
+          <w:bottom w:val="single" w:color="auto" w:sz="4"/>
+          <w:right w:val="single" w:color="auto" w:sz="4"/>
+          <w:insideH w:val="single" w:color="auto" w:sz="4"/>
+          <w:insideV w:val="single" w:color="auto" w:sz="4"/>
+        </w:tblBorders>
+      </w:tblPr>
+      <w:tblGrid>
+        <w:gridCol w:w="2300"/>
+        <w:gridCol w:w="3300"/>
+        <w:gridCol w:w="4038"/>
+      </w:tblGrid>
+      <w:tr>
+        <w:trPr>
+          <w:tblHeader/>
+        </w:trPr>
+        <w:tc>
+          <w:tcPr>
+            <w:tcW w:type="dxa" w:w="2300"/>
+            <w:tcBorders>
+              <w:top w:val="single" w:color="C9B89C" w:sz="4"/>
+              <w:left w:val="single" w:color="C9B89C" w:sz="4"/>
+              <w:bottom w:val="single" w:color="C9B89C" w:sz="4"/>
+              <w:right w:val="single" w:color="C9B89C" w:sz="4"/>
+            </w:tcBorders>
+            <w:shd w:fill="EFE4D0" w:val="clear"/>
+            <w:tcMar>
+              <w:top w:type="dxa" w:w="70"/>
+              <w:left w:type="dxa" w:w="100"/>
+              <w:bottom w:type="dxa" w:w="70"/>
+              <w:right w:type="dxa" w:w="100"/>
+            </w:tcMar>
+          </w:tcPr>
+          <w:p>
+            <w:pPr>
+              <w:spacing w:after="20" w:line="260"/>
+            </w:pPr>
+            <w:r>
+              <w:rPr>
+                <w:rFonts w:ascii="Arial" w:cs="Arial" w:eastAsia="Arial" w:hAnsi="Arial"/>
+                <w:b/>
+                <w:bCs/>
+                <w:color w:val="2B2118"/>
+                <w:sz w:val="19"/>
+                <w:szCs w:val="19"/>
+              </w:rPr>
+              <w:t xml:space="preserve">Chủ đề</w:t>
+            </w:r>
+          </w:p>
+        </w:tc>
+        <w:tc>
+          <w:tcPr>
+            <w:tcW w:type="dxa" w:w="3300"/>
+            <w:tcBorders>
+              <w:top w:val="single" w:color="C9B89C" w:sz="4"/>
+              <w:left w:val="single" w:color="C9B89C" w:sz="4"/>
+              <w:bottom w:val="single" w:color="C9B89C" w:sz="4"/>
+              <w:right w:val="single" w:color="C9B89C" w:sz="4"/>
+            </w:tcBorders>
+            <w:shd w:fill="EFE4D0" w:val="clear"/>
+            <w:tcMar>
+              <w:top w:type="dxa" w:w="70"/>
+              <w:left w:type="dxa" w:w="100"/>
+              <w:bottom w:type="dxa" w:w="70"/>
+              <w:right w:type="dxa" w:w="100"/>
+            </w:tcMar>
+          </w:tcPr>
+          <w:p>
+            <w:pPr>
+              <w:spacing w:after="20" w:line="260"/>
+            </w:pPr>
+            <w:r>
+              <w:rPr>
+                <w:rFonts w:ascii="Arial" w:cs="Arial" w:eastAsia="Arial" w:hAnsi="Arial"/>
+                <w:b/>
+                <w:bCs/>
+                <w:color w:val="2B2118"/>
+                <w:sz w:val="19"/>
+                <w:szCs w:val="19"/>
+              </w:rPr>
+              <w:t xml:space="preserve">Quyết định</w:t>
+            </w:r>
+          </w:p>
+        </w:tc>
+        <w:tc>
+          <w:tcPr>
+            <w:tcW w:type="dxa" w:w="4038"/>
+            <w:tcBorders>
+              <w:top w:val="single" w:color="C9B89C" w:sz="4"/>
+              <w:left w:val="single" w:color="C9B89C" w:sz="4"/>
+              <w:bottom w:val="single" w:color="C9B89C" w:sz="4"/>
+              <w:right w:val="single" w:color="C9B89C" w:sz="4"/>
+            </w:tcBorders>
+            <w:shd w:fill="EFE4D0" w:val="clear"/>
+            <w:tcMar>
+              <w:top w:type="dxa" w:w="70"/>
+              <w:left w:type="dxa" w:w="100"/>
+              <w:bottom w:type="dxa" w:w="70"/>
+              <w:right w:type="dxa" w:w="100"/>
+            </w:tcMar>
+          </w:tcPr>
+          <w:p>
+            <w:pPr>
+              <w:spacing w:after="20" w:line="260"/>
+            </w:pPr>
+            <w:r>
+              <w:rPr>
+                <w:rFonts w:ascii="Arial" w:cs="Arial" w:eastAsia="Arial" w:hAnsi="Arial"/>
+                <w:b/>
+                <w:bCs/>
+                <w:color w:val="2B2118"/>
+                <w:sz w:val="19"/>
+                <w:szCs w:val="19"/>
+              </w:rPr>
+              <w:t xml:space="preserve">Ảnh hưởng tới tài liệu</w:t>
+            </w:r>
+          </w:p>
+        </w:tc>
+      </w:tr>
+      <w:tr>
+        <w:trPr>
+          <w:cantSplit/>
+        </w:trPr>
+        <w:tc>
+          <w:tcPr>
+            <w:tcW w:type="dxa" w:w="2300"/>
+            <w:tcBorders>
+              <w:top w:val="single" w:color="C9B89C" w:sz="4"/>
+              <w:left w:val="single" w:color="C9B89C" w:sz="4"/>
+              <w:bottom w:val="single" w:color="C9B89C" w:sz="4"/>
+              <w:right w:val="single" w:color="C9B89C" w:sz="4"/>
+            </w:tcBorders>
+            <w:tcMar>
+              <w:top w:type="dxa" w:w="70"/>
+              <w:left w:type="dxa" w:w="100"/>
+              <w:bottom w:type="dxa" w:w="70"/>
+              <w:right w:type="dxa" w:w="100"/>
+            </w:tcMar>
+          </w:tcPr>
+          <w:p>
+            <w:pPr>
+              <w:spacing w:after="20" w:line="260"/>
+            </w:pPr>
+            <w:r>
+              <w:rPr>
+                <w:rFonts w:ascii="Arial" w:cs="Arial" w:eastAsia="Arial" w:hAnsi="Arial"/>
+                <w:b w:val="false"/>
+                <w:bCs w:val="false"/>
+                <w:color w:val="2B2118"/>
+                <w:sz w:val="19"/>
+                <w:szCs w:val="19"/>
+              </w:rPr>
+              <w:t xml:space="preserve">Thời gian</w:t>
+            </w:r>
+          </w:p>
+        </w:tc>
+        <w:tc>
+          <w:tcPr>
+            <w:tcW w:type="dxa" w:w="3300"/>
+            <w:tcBorders>
+              <w:top w:val="single" w:color="C9B89C" w:sz="4"/>
+              <w:left w:val="single" w:color="C9B89C" w:sz="4"/>
+              <w:bottom w:val="single" w:color="C9B89C" w:sz="4"/>
+              <w:right w:val="single" w:color="C9B89C" w:sz="4"/>
+            </w:tcBorders>
+            <w:tcMar>
+              <w:top w:type="dxa" w:w="70"/>
+              <w:left w:type="dxa" w:w="100"/>
+              <w:bottom w:type="dxa" w:w="70"/>
+              <w:right w:type="dxa" w:w="100"/>
+            </w:tcMar>
+          </w:tcPr>
+          <w:p>
+            <w:pPr>
+              <w:spacing w:after="20" w:line="260"/>
+            </w:pPr>
+            <w:r>
+              <w:rPr>
+                <w:rFonts w:ascii="Arial" w:cs="Arial" w:eastAsia="Arial" w:hAnsi="Arial"/>
+                <w:b w:val="false"/>
+                <w:bCs w:val="false"/>
+                <w:color w:val="2B2118"/>
+                <w:sz w:val="19"/>
+                <w:szCs w:val="19"/>
+              </w:rPr>
+              <w:t xml:space="preserve">Phương án B: giữ ngày game 20 phút, nén lịch chính trị.</w:t>
+            </w:r>
+          </w:p>
+        </w:tc>
+        <w:tc>
+          <w:tcPr>
+            <w:tcW w:type="dxa" w:w="4038"/>
+            <w:tcBorders>
+              <w:top w:val="single" w:color="C9B89C" w:sz="4"/>
+              <w:left w:val="single" w:color="C9B89C" w:sz="4"/>
+              <w:bottom w:val="single" w:color="C9B89C" w:sz="4"/>
+              <w:right w:val="single" w:color="C9B89C" w:sz="4"/>
+            </w:tcBorders>
+            <w:tcMar>
+              <w:top w:type="dxa" w:w="70"/>
+              <w:left w:type="dxa" w:w="100"/>
+              <w:bottom w:type="dxa" w:w="70"/>
+              <w:right w:type="dxa" w:w="100"/>
+            </w:tcMar>
+          </w:tcPr>
+          <w:p>
+            <w:pPr>
+              <w:spacing w:after="20" w:line="260"/>
+            </w:pPr>
+            <w:r>
+              <w:rPr>
+                <w:rFonts w:ascii="Arial" w:cs="Arial" w:eastAsia="Arial" w:hAnsi="Arial"/>
+                <w:b w:val="false"/>
+                <w:bCs w:val="false"/>
+                <w:color w:val="2B2118"/>
+                <w:sz w:val="19"/>
+                <w:szCs w:val="19"/>
+              </w:rPr>
+              <w:t xml:space="preserve">Mục 5 và bảng tham số dùng ngày game theo B.</w:t>
+            </w:r>
+          </w:p>
+        </w:tc>
+      </w:tr>
+      <w:tr>
+        <w:trPr>
+          <w:cantSplit/>
+        </w:trPr>
+        <w:tc>
+          <w:tcPr>
+            <w:tcW w:type="dxa" w:w="2300"/>
+            <w:tcBorders>
+              <w:top w:val="single" w:color="C9B89C" w:sz="4"/>
+              <w:left w:val="single" w:color="C9B89C" w:sz="4"/>
+              <w:bottom w:val="single" w:color="C9B89C" w:sz="4"/>
+              <w:right w:val="single" w:color="C9B89C" w:sz="4"/>
+            </w:tcBorders>
+            <w:tcMar>
+              <w:top w:type="dxa" w:w="70"/>
+              <w:left w:type="dxa" w:w="100"/>
+              <w:bottom w:type="dxa" w:w="70"/>
+              <w:right w:type="dxa" w:w="100"/>
+            </w:tcMar>
+          </w:tcPr>
+          <w:p>
+            <w:pPr>
+              <w:spacing w:after="20" w:line="260"/>
+            </w:pPr>
+            <w:r>
+              <w:rPr>
+                <w:rFonts w:ascii="Arial" w:cs="Arial" w:eastAsia="Arial" w:hAnsi="Arial"/>
+                <w:b w:val="false"/>
+                <w:bCs w:val="false"/>
+                <w:color w:val="2B2118"/>
+                <w:sz w:val="19"/>
+                <w:szCs w:val="19"/>
+              </w:rPr>
+              <w:t xml:space="preserve">Số làng</w:t>
+            </w:r>
+          </w:p>
+        </w:tc>
+        <w:tc>
+          <w:tcPr>
+            <w:tcW w:type="dxa" w:w="3300"/>
+            <w:tcBorders>
+              <w:top w:val="single" w:color="C9B89C" w:sz="4"/>
+              <w:left w:val="single" w:color="C9B89C" w:sz="4"/>
+              <w:bottom w:val="single" w:color="C9B89C" w:sz="4"/>
+              <w:right w:val="single" w:color="C9B89C" w:sz="4"/>
+            </w:tcBorders>
+            <w:tcMar>
+              <w:top w:type="dxa" w:w="70"/>
+              <w:left w:type="dxa" w:w="100"/>
+              <w:bottom w:type="dxa" w:w="70"/>
+              <w:right w:type="dxa" w:w="100"/>
+            </w:tcMar>
+          </w:tcPr>
+          <w:p>
+            <w:pPr>
+              <w:spacing w:after="20" w:line="260"/>
+            </w:pPr>
+            <w:r>
+              <w:rPr>
+                <w:rFonts w:ascii="Arial" w:cs="Arial" w:eastAsia="Arial" w:hAnsi="Arial"/>
+                <w:b w:val="false"/>
+                <w:bCs w:val="false"/>
+                <w:color w:val="2B2118"/>
+                <w:sz w:val="19"/>
+                <w:szCs w:val="19"/>
+              </w:rPr>
+              <w:t xml:space="preserve">Thử trước với 3 làng hiện có.</w:t>
+            </w:r>
+          </w:p>
+        </w:tc>
+        <w:tc>
+          <w:tcPr>
+            <w:tcW w:type="dxa" w:w="4038"/>
+            <w:tcBorders>
+              <w:top w:val="single" w:color="C9B89C" w:sz="4"/>
+              <w:left w:val="single" w:color="C9B89C" w:sz="4"/>
+              <w:bottom w:val="single" w:color="C9B89C" w:sz="4"/>
+              <w:right w:val="single" w:color="C9B89C" w:sz="4"/>
+            </w:tcBorders>
+            <w:tcMar>
+              <w:top w:type="dxa" w:w="70"/>
+              <w:left w:type="dxa" w:w="100"/>
+              <w:bottom w:type="dxa" w:w="70"/>
+              <w:right w:type="dxa" w:w="100"/>
+            </w:tcMar>
+          </w:tcPr>
+          <w:p>
+            <w:pPr>
+              <w:spacing w:after="20" w:line="260"/>
+            </w:pPr>
+            <w:r>
+              <w:rPr>
+                <w:rFonts w:ascii="Arial" w:cs="Arial" w:eastAsia="Arial" w:hAnsi="Arial"/>
+                <w:b w:val="false"/>
+                <w:bCs w:val="false"/>
+                <w:color w:val="2B2118"/>
+                <w:sz w:val="19"/>
+                <w:szCs w:val="19"/>
+              </w:rPr>
+              <w:t xml:space="preserve">Bá chủ chọn trong 3 làng; thêm 3 làng sau là thêm dữ liệu.</w:t>
+            </w:r>
+          </w:p>
+        </w:tc>
+      </w:tr>
+      <w:tr>
+        <w:trPr>
+          <w:cantSplit/>
+        </w:trPr>
+        <w:tc>
+          <w:tcPr>
+            <w:tcW w:type="dxa" w:w="2300"/>
+            <w:tcBorders>
+              <w:top w:val="single" w:color="C9B89C" w:sz="4"/>
+              <w:left w:val="single" w:color="C9B89C" w:sz="4"/>
+              <w:bottom w:val="single" w:color="C9B89C" w:sz="4"/>
+              <w:right w:val="single" w:color="C9B89C" w:sz="4"/>
+            </w:tcBorders>
+            <w:tcMar>
+              <w:top w:type="dxa" w:w="70"/>
+              <w:left w:type="dxa" w:w="100"/>
+              <w:bottom w:type="dxa" w:w="70"/>
+              <w:right w:type="dxa" w:w="100"/>
+            </w:tcMar>
+          </w:tcPr>
+          <w:p>
+            <w:pPr>
+              <w:spacing w:after="20" w:line="260"/>
+            </w:pPr>
+            <w:r>
+              <w:rPr>
+                <w:rFonts w:ascii="Arial" w:cs="Arial" w:eastAsia="Arial" w:hAnsi="Arial"/>
+                <w:b w:val="false"/>
+                <w:bCs w:val="false"/>
+                <w:color w:val="2B2118"/>
+                <w:sz w:val="19"/>
+                <w:szCs w:val="19"/>
+              </w:rPr>
+              <w:t xml:space="preserve">Bá chủ</w:t>
+            </w:r>
+          </w:p>
+        </w:tc>
+        <w:tc>
+          <w:tcPr>
+            <w:tcW w:type="dxa" w:w="3300"/>
+            <w:tcBorders>
+              <w:top w:val="single" w:color="C9B89C" w:sz="4"/>
+              <w:left w:val="single" w:color="C9B89C" w:sz="4"/>
+              <w:bottom w:val="single" w:color="C9B89C" w:sz="4"/>
+              <w:right w:val="single" w:color="C9B89C" w:sz="4"/>
+            </w:tcBorders>
+            <w:tcMar>
+              <w:top w:type="dxa" w:w="70"/>
+              <w:left w:type="dxa" w:w="100"/>
+              <w:bottom w:type="dxa" w:w="70"/>
+              <w:right w:type="dxa" w:w="100"/>
+            </w:tcMar>
+          </w:tcPr>
+          <w:p>
+            <w:pPr>
+              <w:spacing w:after="20" w:line="260"/>
+            </w:pPr>
+            <w:r>
+              <w:rPr>
+                <w:rFonts w:ascii="Arial" w:cs="Arial" w:eastAsia="Arial" w:hAnsi="Arial"/>
+                <w:b w:val="false"/>
+                <w:bCs w:val="false"/>
+                <w:color w:val="2B2118"/>
+                <w:sz w:val="19"/>
+                <w:szCs w:val="19"/>
+              </w:rPr>
+              <w:t xml:space="preserve">Ngẫu nhiên theo tăng trưởng, không cố định.</w:t>
+            </w:r>
+          </w:p>
+        </w:tc>
+        <w:tc>
+          <w:tcPr>
+            <w:tcW w:type="dxa" w:w="4038"/>
+            <w:tcBorders>
+              <w:top w:val="single" w:color="C9B89C" w:sz="4"/>
+              <w:left w:val="single" w:color="C9B89C" w:sz="4"/>
+              <w:bottom w:val="single" w:color="C9B89C" w:sz="4"/>
+              <w:right w:val="single" w:color="C9B89C" w:sz="4"/>
+            </w:tcBorders>
+            <w:tcMar>
+              <w:top w:type="dxa" w:w="70"/>
+              <w:left w:type="dxa" w:w="100"/>
+              <w:bottom w:type="dxa" w:w="70"/>
+              <w:right w:type="dxa" w:w="100"/>
+            </w:tcMar>
+          </w:tcPr>
+          <w:p>
+            <w:pPr>
+              <w:spacing w:after="20" w:line="260"/>
+            </w:pPr>
+            <w:r>
+              <w:rPr>
+                <w:rFonts w:ascii="Arial" w:cs="Arial" w:eastAsia="Arial" w:hAnsi="Arial"/>
+                <w:b w:val="false"/>
+                <w:bCs w:val="false"/>
+                <w:color w:val="2B2118"/>
+                <w:sz w:val="19"/>
+                <w:szCs w:val="19"/>
+              </w:rPr>
+              <w:t xml:space="preserve">Mục 3 và 5.1.</w:t>
+            </w:r>
+          </w:p>
+        </w:tc>
+      </w:tr>
+      <w:tr>
+        <w:trPr>
+          <w:cantSplit/>
+        </w:trPr>
+        <w:tc>
+          <w:tcPr>
+            <w:tcW w:type="dxa" w:w="2300"/>
+            <w:tcBorders>
+              <w:top w:val="single" w:color="C9B89C" w:sz="4"/>
+              <w:left w:val="single" w:color="C9B89C" w:sz="4"/>
+              <w:bottom w:val="single" w:color="C9B89C" w:sz="4"/>
+              <w:right w:val="single" w:color="C9B89C" w:sz="4"/>
+            </w:tcBorders>
+            <w:tcMar>
+              <w:top w:type="dxa" w:w="70"/>
+              <w:left w:type="dxa" w:w="100"/>
+              <w:bottom w:type="dxa" w:w="70"/>
+              <w:right w:type="dxa" w:w="100"/>
+            </w:tcMar>
+          </w:tcPr>
+          <w:p>
+            <w:pPr>
+              <w:spacing w:after="20" w:line="260"/>
+            </w:pPr>
+            <w:r>
+              <w:rPr>
+                <w:rFonts w:ascii="Arial" w:cs="Arial" w:eastAsia="Arial" w:hAnsi="Arial"/>
+                <w:b w:val="false"/>
+                <w:bCs w:val="false"/>
+                <w:color w:val="2B2118"/>
+                <w:sz w:val="19"/>
+                <w:szCs w:val="19"/>
+              </w:rPr>
+              <w:t xml:space="preserve">Mức thua</w:t>
+            </w:r>
+          </w:p>
+        </w:tc>
+        <w:tc>
+          <w:tcPr>
+            <w:tcW w:type="dxa" w:w="3300"/>
+            <w:tcBorders>
+              <w:top w:val="single" w:color="C9B89C" w:sz="4"/>
+              <w:left w:val="single" w:color="C9B89C" w:sz="4"/>
+              <w:bottom w:val="single" w:color="C9B89C" w:sz="4"/>
+              <w:right w:val="single" w:color="C9B89C" w:sz="4"/>
+            </w:tcBorders>
+            <w:tcMar>
+              <w:top w:type="dxa" w:w="70"/>
+              <w:left w:type="dxa" w:w="100"/>
+              <w:bottom w:type="dxa" w:w="70"/>
+              <w:right w:type="dxa" w:w="100"/>
+            </w:tcMar>
+          </w:tcPr>
+          <w:p>
+            <w:pPr>
+              <w:spacing w:after="20" w:line="260"/>
+            </w:pPr>
+            <w:r>
+              <w:rPr>
+                <w:rFonts w:ascii="Arial" w:cs="Arial" w:eastAsia="Arial" w:hAnsi="Arial"/>
+                <w:b w:val="false"/>
+                <w:bCs w:val="false"/>
+                <w:color w:val="2B2118"/>
+                <w:sz w:val="19"/>
+                <w:szCs w:val="19"/>
+              </w:rPr>
+              <w:t xml:space="preserve">Thua theo bậc; thua nghĩa là quay về lúc gặp sứ giả của vòng lặp hiện tại.</w:t>
+            </w:r>
+          </w:p>
+        </w:tc>
+        <w:tc>
+          <w:tcPr>
+            <w:tcW w:type="dxa" w:w="4038"/>
+            <w:tcBorders>
+              <w:top w:val="single" w:color="C9B89C" w:sz="4"/>
+              <w:left w:val="single" w:color="C9B89C" w:sz="4"/>
+              <w:bottom w:val="single" w:color="C9B89C" w:sz="4"/>
+              <w:right w:val="single" w:color="C9B89C" w:sz="4"/>
+            </w:tcBorders>
+            <w:tcMar>
+              <w:top w:type="dxa" w:w="70"/>
+              <w:left w:type="dxa" w:w="100"/>
+              <w:bottom w:type="dxa" w:w="70"/>
+              <w:right w:type="dxa" w:w="100"/>
+            </w:tcMar>
+          </w:tcPr>
+          <w:p>
+            <w:pPr>
+              <w:spacing w:after="20" w:line="260"/>
+            </w:pPr>
+            <w:r>
+              <w:rPr>
+                <w:rFonts w:ascii="Arial" w:cs="Arial" w:eastAsia="Arial" w:hAnsi="Arial"/>
+                <w:b w:val="false"/>
+                <w:bCs w:val="false"/>
+                <w:color w:val="2B2118"/>
+                <w:sz w:val="19"/>
+                <w:szCs w:val="19"/>
+              </w:rPr>
+              <w:t xml:space="preserve">Cần một điểm lưu riêng ngay trước hộp thoại sứ giả của mỗi vòng (mục 11.1).</w:t>
+            </w:r>
+          </w:p>
+        </w:tc>
+      </w:tr>
+      <w:tr>
+        <w:trPr>
+          <w:cantSplit/>
+        </w:trPr>
+        <w:tc>
+          <w:tcPr>
+            <w:tcW w:type="dxa" w:w="2300"/>
+            <w:tcBorders>
+              <w:top w:val="single" w:color="C9B89C" w:sz="4"/>
+              <w:left w:val="single" w:color="C9B89C" w:sz="4"/>
+              <w:bottom w:val="single" w:color="C9B89C" w:sz="4"/>
+              <w:right w:val="single" w:color="C9B89C" w:sz="4"/>
+            </w:tcBorders>
+            <w:tcMar>
+              <w:top w:type="dxa" w:w="70"/>
+              <w:left w:type="dxa" w:w="100"/>
+              <w:bottom w:type="dxa" w:w="70"/>
+              <w:right w:type="dxa" w:w="100"/>
+            </w:tcMar>
+          </w:tcPr>
+          <w:p>
+            <w:pPr>
+              <w:spacing w:after="20" w:line="260"/>
+            </w:pPr>
+            <w:r>
+              <w:rPr>
+                <w:rFonts w:ascii="Arial" w:cs="Arial" w:eastAsia="Arial" w:hAnsi="Arial"/>
+                <w:b w:val="false"/>
+                <w:bCs w:val="false"/>
+                <w:color w:val="2B2118"/>
+                <w:sz w:val="19"/>
+                <w:szCs w:val="19"/>
+              </w:rPr>
+              <w:t xml:space="preserve">Thông tin</w:t>
+            </w:r>
+          </w:p>
+        </w:tc>
+        <w:tc>
+          <w:tcPr>
+            <w:tcW w:type="dxa" w:w="3300"/>
+            <w:tcBorders>
+              <w:top w:val="single" w:color="C9B89C" w:sz="4"/>
+              <w:left w:val="single" w:color="C9B89C" w:sz="4"/>
+              <w:bottom w:val="single" w:color="C9B89C" w:sz="4"/>
+              <w:right w:val="single" w:color="C9B89C" w:sz="4"/>
+            </w:tcBorders>
+            <w:tcMar>
+              <w:top w:type="dxa" w:w="70"/>
+              <w:left w:type="dxa" w:w="100"/>
+              <w:bottom w:type="dxa" w:w="70"/>
+              <w:right w:type="dxa" w:w="100"/>
+            </w:tcMar>
+          </w:tcPr>
+          <w:p>
+            <w:pPr>
+              <w:spacing w:after="20" w:line="260"/>
+            </w:pPr>
+            <w:r>
+              <w:rPr>
+                <w:rFonts w:ascii="Arial" w:cs="Arial" w:eastAsia="Arial" w:hAnsi="Arial"/>
+                <w:b w:val="false"/>
+                <w:bCs w:val="false"/>
+                <w:color w:val="2B2118"/>
+                <w:sz w:val="19"/>
+                <w:szCs w:val="19"/>
+              </w:rPr>
+              <w:t xml:space="preserve">Chỉ báo bằng lời; người chơi tự tìm bằng chứng; bằng chứng đôi khi vẫn sai.</w:t>
+            </w:r>
+          </w:p>
+        </w:tc>
+        <w:tc>
+          <w:tcPr>
+            <w:tcW w:type="dxa" w:w="4038"/>
+            <w:tcBorders>
+              <w:top w:val="single" w:color="C9B89C" w:sz="4"/>
+              <w:left w:val="single" w:color="C9B89C" w:sz="4"/>
+              <w:bottom w:val="single" w:color="C9B89C" w:sz="4"/>
+              <w:right w:val="single" w:color="C9B89C" w:sz="4"/>
+            </w:tcBorders>
+            <w:tcMar>
+              <w:top w:type="dxa" w:w="70"/>
+              <w:left w:type="dxa" w:w="100"/>
+              <w:bottom w:type="dxa" w:w="70"/>
+              <w:right w:type="dxa" w:w="100"/>
+            </w:tcMar>
+          </w:tcPr>
+          <w:p>
+            <w:pPr>
+              <w:spacing w:after="20" w:line="260"/>
+            </w:pPr>
+            <w:r>
+              <w:rPr>
+                <w:rFonts w:ascii="Arial" w:cs="Arial" w:eastAsia="Arial" w:hAnsi="Arial"/>
+                <w:b w:val="false"/>
+                <w:bCs w:val="false"/>
+                <w:color w:val="2B2118"/>
+                <w:sz w:val="19"/>
+                <w:szCs w:val="19"/>
+              </w:rPr>
+              <w:t xml:space="preserve">Không có thanh Lòng tin hay Nghi ngờ trên giao diện (mục 7.1, 8.2).</w:t>
+            </w:r>
+          </w:p>
+        </w:tc>
+      </w:tr>
+      <w:tr>
+        <w:trPr>
+          <w:cantSplit/>
+        </w:trPr>
+        <w:tc>
+          <w:tcPr>
+            <w:tcW w:type="dxa" w:w="2300"/>
+            <w:tcBorders>
+              <w:top w:val="single" w:color="C9B89C" w:sz="4"/>
+              <w:left w:val="single" w:color="C9B89C" w:sz="4"/>
+              <w:bottom w:val="single" w:color="C9B89C" w:sz="4"/>
+              <w:right w:val="single" w:color="C9B89C" w:sz="4"/>
+            </w:tcBorders>
+            <w:tcMar>
+              <w:top w:type="dxa" w:w="70"/>
+              <w:left w:type="dxa" w:w="100"/>
+              <w:bottom w:type="dxa" w:w="70"/>
+              <w:right w:type="dxa" w:w="100"/>
+            </w:tcMar>
+          </w:tcPr>
+          <w:p>
+            <w:pPr>
+              <w:spacing w:after="20" w:line="260"/>
+            </w:pPr>
+            <w:r>
+              <w:rPr>
+                <w:rFonts w:ascii="Arial" w:cs="Arial" w:eastAsia="Arial" w:hAnsi="Arial"/>
+                <w:b w:val="false"/>
+                <w:bCs w:val="false"/>
+                <w:color w:val="2B2118"/>
+                <w:sz w:val="19"/>
+                <w:szCs w:val="19"/>
+              </w:rPr>
+              <w:t xml:space="preserve">Tạm dừng</w:t>
+            </w:r>
+          </w:p>
+        </w:tc>
+        <w:tc>
+          <w:tcPr>
+            <w:tcW w:type="dxa" w:w="3300"/>
+            <w:tcBorders>
+              <w:top w:val="single" w:color="C9B89C" w:sz="4"/>
+              <w:left w:val="single" w:color="C9B89C" w:sz="4"/>
+              <w:bottom w:val="single" w:color="C9B89C" w:sz="4"/>
+              <w:right w:val="single" w:color="C9B89C" w:sz="4"/>
+            </w:tcBorders>
+            <w:tcMar>
+              <w:top w:type="dxa" w:w="70"/>
+              <w:left w:type="dxa" w:w="100"/>
+              <w:bottom w:type="dxa" w:w="70"/>
+              <w:right w:type="dxa" w:w="100"/>
+            </w:tcMar>
+          </w:tcPr>
+          <w:p>
+            <w:pPr>
+              <w:spacing w:after="20" w:line="260"/>
+            </w:pPr>
+            <w:r>
+              <w:rPr>
+                <w:rFonts w:ascii="Arial" w:cs="Arial" w:eastAsia="Arial" w:hAnsi="Arial"/>
+                <w:b w:val="false"/>
+                <w:bCs w:val="false"/>
+                <w:color w:val="2B2118"/>
+                <w:sz w:val="19"/>
+                <w:szCs w:val="19"/>
+              </w:rPr>
+              <w:t xml:space="preserve">Dừng game ở sứ giả và các quyết định lớn; tin đồn nhỏ không dừng.</w:t>
+            </w:r>
+          </w:p>
+        </w:tc>
+        <w:tc>
+          <w:tcPr>
+            <w:tcW w:type="dxa" w:w="4038"/>
+            <w:tcBorders>
+              <w:top w:val="single" w:color="C9B89C" w:sz="4"/>
+              <w:left w:val="single" w:color="C9B89C" w:sz="4"/>
+              <w:bottom w:val="single" w:color="C9B89C" w:sz="4"/>
+              <w:right w:val="single" w:color="C9B89C" w:sz="4"/>
+            </w:tcBorders>
+            <w:tcMar>
+              <w:top w:type="dxa" w:w="70"/>
+              <w:left w:type="dxa" w:w="100"/>
+              <w:bottom w:type="dxa" w:w="70"/>
+              <w:right w:type="dxa" w:w="100"/>
+            </w:tcMar>
+          </w:tcPr>
+          <w:p>
+            <w:pPr>
+              <w:spacing w:after="20" w:line="260"/>
+            </w:pPr>
+            <w:r>
+              <w:rPr>
+                <w:rFonts w:ascii="Arial" w:cs="Arial" w:eastAsia="Arial" w:hAnsi="Arial"/>
+                <w:b w:val="false"/>
+                <w:bCs w:val="false"/>
+                <w:color w:val="2B2118"/>
+                <w:sz w:val="19"/>
+                <w:szCs w:val="19"/>
+              </w:rPr>
+              <w:t xml:space="preserve">Hộp thoại lớn dùng khung xác nhận và tự tạm dừng.</w:t>
+            </w:r>
+          </w:p>
+        </w:tc>
+      </w:tr>
+      <w:tr>
+        <w:trPr>
+          <w:cantSplit/>
+        </w:trPr>
+        <w:tc>
+          <w:tcPr>
+            <w:tcW w:type="dxa" w:w="2300"/>
+            <w:tcBorders>
+              <w:top w:val="single" w:color="C9B89C" w:sz="4"/>
+              <w:left w:val="single" w:color="C9B89C" w:sz="4"/>
+              <w:bottom w:val="single" w:color="C9B89C" w:sz="4"/>
+              <w:right w:val="single" w:color="C9B89C" w:sz="4"/>
+            </w:tcBorders>
+            <w:tcMar>
+              <w:top w:type="dxa" w:w="70"/>
+              <w:left w:type="dxa" w:w="100"/>
+              <w:bottom w:type="dxa" w:w="70"/>
+              <w:right w:type="dxa" w:w="100"/>
+            </w:tcMar>
+          </w:tcPr>
+          <w:p>
+            <w:pPr>
+              <w:spacing w:after="20" w:line="260"/>
+            </w:pPr>
+            <w:r>
+              <w:rPr>
+                <w:rFonts w:ascii="Arial" w:cs="Arial" w:eastAsia="Arial" w:hAnsi="Arial"/>
+                <w:b w:val="false"/>
+                <w:bCs w:val="false"/>
+                <w:color w:val="2B2118"/>
+                <w:sz w:val="19"/>
+                <w:szCs w:val="19"/>
+              </w:rPr>
+              <w:t xml:space="preserve">Chuẩn tiền</w:t>
+            </w:r>
+          </w:p>
+        </w:tc>
+        <w:tc>
+          <w:tcPr>
+            <w:tcW w:type="dxa" w:w="3300"/>
+            <w:tcBorders>
+              <w:top w:val="single" w:color="C9B89C" w:sz="4"/>
+              <w:left w:val="single" w:color="C9B89C" w:sz="4"/>
+              <w:bottom w:val="single" w:color="C9B89C" w:sz="4"/>
+              <w:right w:val="single" w:color="C9B89C" w:sz="4"/>
+            </w:tcBorders>
+            <w:tcMar>
+              <w:top w:type="dxa" w:w="70"/>
+              <w:left w:type="dxa" w:w="100"/>
+              <w:bottom w:type="dxa" w:w="70"/>
+              <w:right w:type="dxa" w:w="100"/>
+            </w:tcMar>
+          </w:tcPr>
+          <w:p>
+            <w:pPr>
+              <w:spacing w:after="20" w:line="260"/>
+            </w:pPr>
+            <w:r>
+              <w:rPr>
+                <w:rFonts w:ascii="Arial" w:cs="Arial" w:eastAsia="Arial" w:hAnsi="Arial"/>
+                <w:b w:val="false"/>
+                <w:bCs w:val="false"/>
+                <w:color w:val="2B2118"/>
+                <w:sz w:val="19"/>
+                <w:szCs w:val="19"/>
+              </w:rPr>
+              <w:t xml:space="preserve">Danh sách vật làm tiền đủ; vỏ sò là mặc định.</w:t>
+            </w:r>
+          </w:p>
+        </w:tc>
+        <w:tc>
+          <w:tcPr>
+            <w:tcW w:type="dxa" w:w="4038"/>
+            <w:tcBorders>
+              <w:top w:val="single" w:color="C9B89C" w:sz="4"/>
+              <w:left w:val="single" w:color="C9B89C" w:sz="4"/>
+              <w:bottom w:val="single" w:color="C9B89C" w:sz="4"/>
+              <w:right w:val="single" w:color="C9B89C" w:sz="4"/>
+            </w:tcBorders>
+            <w:tcMar>
+              <w:top w:type="dxa" w:w="70"/>
+              <w:left w:type="dxa" w:w="100"/>
+              <w:bottom w:type="dxa" w:w="70"/>
+              <w:right w:type="dxa" w:w="100"/>
+            </w:tcMar>
+          </w:tcPr>
+          <w:p>
+            <w:pPr>
+              <w:spacing w:after="20" w:line="260"/>
+            </w:pPr>
+            <w:r>
+              <w:rPr>
+                <w:rFonts w:ascii="Arial" w:cs="Arial" w:eastAsia="Arial" w:hAnsi="Arial"/>
+                <w:b w:val="false"/>
+                <w:bCs w:val="false"/>
+                <w:color w:val="2B2118"/>
+                <w:sz w:val="19"/>
+                <w:szCs w:val="19"/>
+              </w:rPr>
+              <w:t xml:space="preserve">Mục 4.4.</w:t>
+            </w:r>
+          </w:p>
+        </w:tc>
+      </w:tr>
+      <w:tr>
+        <w:trPr>
+          <w:cantSplit/>
+        </w:trPr>
+        <w:tc>
+          <w:tcPr>
+            <w:tcW w:type="dxa" w:w="2300"/>
+            <w:tcBorders>
+              <w:top w:val="single" w:color="C9B89C" w:sz="4"/>
+              <w:left w:val="single" w:color="C9B89C" w:sz="4"/>
+              <w:bottom w:val="single" w:color="C9B89C" w:sz="4"/>
+              <w:right w:val="single" w:color="C9B89C" w:sz="4"/>
+            </w:tcBorders>
+            <w:tcMar>
+              <w:top w:type="dxa" w:w="70"/>
+              <w:left w:type="dxa" w:w="100"/>
+              <w:bottom w:type="dxa" w:w="70"/>
+              <w:right w:type="dxa" w:w="100"/>
+            </w:tcMar>
+          </w:tcPr>
+          <w:p>
+            <w:pPr>
+              <w:spacing w:after="20" w:line="260"/>
+            </w:pPr>
+            <w:r>
+              <w:rPr>
+                <w:rFonts w:ascii="Arial" w:cs="Arial" w:eastAsia="Arial" w:hAnsi="Arial"/>
+                <w:b w:val="false"/>
+                <w:bCs w:val="false"/>
+                <w:color w:val="2B2118"/>
+                <w:sz w:val="19"/>
+                <w:szCs w:val="19"/>
+              </w:rPr>
+              <w:t xml:space="preserve">Giết sứ giả</w:t>
+            </w:r>
+          </w:p>
+        </w:tc>
+        <w:tc>
+          <w:tcPr>
+            <w:tcW w:type="dxa" w:w="3300"/>
+            <w:tcBorders>
+              <w:top w:val="single" w:color="C9B89C" w:sz="4"/>
+              <w:left w:val="single" w:color="C9B89C" w:sz="4"/>
+              <w:bottom w:val="single" w:color="C9B89C" w:sz="4"/>
+              <w:right w:val="single" w:color="C9B89C" w:sz="4"/>
+            </w:tcBorders>
+            <w:tcMar>
+              <w:top w:type="dxa" w:w="70"/>
+              <w:left w:type="dxa" w:w="100"/>
+              <w:bottom w:type="dxa" w:w="70"/>
+              <w:right w:type="dxa" w:w="100"/>
+            </w:tcMar>
+          </w:tcPr>
+          <w:p>
+            <w:pPr>
+              <w:spacing w:after="20" w:line="260"/>
+            </w:pPr>
+            <w:r>
+              <w:rPr>
+                <w:rFonts w:ascii="Arial" w:cs="Arial" w:eastAsia="Arial" w:hAnsi="Arial"/>
+                <w:b w:val="false"/>
+                <w:bCs w:val="false"/>
+                <w:color w:val="2B2118"/>
+                <w:sz w:val="19"/>
+                <w:szCs w:val="19"/>
+              </w:rPr>
+              <w:t xml:space="preserve">Có đường sống, tỷ lệ rất thấp, trừ khi chiến thuật rất hay.</w:t>
+            </w:r>
+          </w:p>
+        </w:tc>
+        <w:tc>
+          <w:tcPr>
+            <w:tcW w:type="dxa" w:w="4038"/>
+            <w:tcBorders>
+              <w:top w:val="single" w:color="C9B89C" w:sz="4"/>
+              <w:left w:val="single" w:color="C9B89C" w:sz="4"/>
+              <w:bottom w:val="single" w:color="C9B89C" w:sz="4"/>
+              <w:right w:val="single" w:color="C9B89C" w:sz="4"/>
+            </w:tcBorders>
+            <w:tcMar>
+              <w:top w:type="dxa" w:w="70"/>
+              <w:left w:type="dxa" w:w="100"/>
+              <w:bottom w:type="dxa" w:w="70"/>
+              <w:right w:type="dxa" w:w="100"/>
+            </w:tcMar>
+          </w:tcPr>
+          <w:p>
+            <w:pPr>
+              <w:spacing w:after="20" w:line="260"/>
+            </w:pPr>
+            <w:r>
+              <w:rPr>
+                <w:rFonts w:ascii="Arial" w:cs="Arial" w:eastAsia="Arial" w:hAnsi="Arial"/>
+                <w:b w:val="false"/>
+                <w:bCs w:val="false"/>
+                <w:color w:val="2B2118"/>
+                <w:sz w:val="19"/>
+                <w:szCs w:val="19"/>
+              </w:rPr>
+              <w:t xml:space="preserve">Mục 6 và 7.4.</w:t>
+            </w:r>
+          </w:p>
+        </w:tc>
+      </w:tr>
+      <w:tr>
+        <w:trPr>
+          <w:cantSplit/>
+        </w:trPr>
+        <w:tc>
+          <w:tcPr>
+            <w:tcW w:type="dxa" w:w="2300"/>
+            <w:tcBorders>
+              <w:top w:val="single" w:color="C9B89C" w:sz="4"/>
+              <w:left w:val="single" w:color="C9B89C" w:sz="4"/>
+              <w:bottom w:val="single" w:color="C9B89C" w:sz="4"/>
+              <w:right w:val="single" w:color="C9B89C" w:sz="4"/>
+            </w:tcBorders>
+            <w:tcMar>
+              <w:top w:type="dxa" w:w="70"/>
+              <w:left w:type="dxa" w:w="100"/>
+              <w:bottom w:type="dxa" w:w="70"/>
+              <w:right w:type="dxa" w:w="100"/>
+            </w:tcMar>
+          </w:tcPr>
+          <w:p>
+            <w:pPr>
+              <w:spacing w:after="20" w:line="260"/>
+            </w:pPr>
+            <w:r>
+              <w:rPr>
+                <w:rFonts w:ascii="Arial" w:cs="Arial" w:eastAsia="Arial" w:hAnsi="Arial"/>
+                <w:b w:val="false"/>
+                <w:bCs w:val="false"/>
+                <w:color w:val="2B2118"/>
+                <w:sz w:val="19"/>
+                <w:szCs w:val="19"/>
+              </w:rPr>
+              <w:t xml:space="preserve">Làm vua</w:t>
+            </w:r>
+          </w:p>
+        </w:tc>
+        <w:tc>
+          <w:tcPr>
+            <w:tcW w:type="dxa" w:w="3300"/>
+            <w:tcBorders>
+              <w:top w:val="single" w:color="C9B89C" w:sz="4"/>
+              <w:left w:val="single" w:color="C9B89C" w:sz="4"/>
+              <w:bottom w:val="single" w:color="C9B89C" w:sz="4"/>
+              <w:right w:val="single" w:color="C9B89C" w:sz="4"/>
+            </w:tcBorders>
+            <w:tcMar>
+              <w:top w:type="dxa" w:w="70"/>
+              <w:left w:type="dxa" w:w="100"/>
+              <w:bottom w:type="dxa" w:w="70"/>
+              <w:right w:type="dxa" w:w="100"/>
+            </w:tcMar>
+          </w:tcPr>
+          <w:p>
+            <w:pPr>
+              <w:spacing w:after="20" w:line="260"/>
+            </w:pPr>
+            <w:r>
+              <w:rPr>
+                <w:rFonts w:ascii="Arial" w:cs="Arial" w:eastAsia="Arial" w:hAnsi="Arial"/>
+                <w:b w:val="false"/>
+                <w:bCs w:val="false"/>
+                <w:color w:val="2B2118"/>
+                <w:sz w:val="19"/>
+                <w:szCs w:val="19"/>
+              </w:rPr>
+              <w:t xml:space="preserve">Theo cơ chế mục 9 (giữ ngôi, chư hầu, làng khác trỗi dậy).</w:t>
+            </w:r>
+          </w:p>
+        </w:tc>
+        <w:tc>
+          <w:tcPr>
+            <w:tcW w:type="dxa" w:w="4038"/>
+            <w:tcBorders>
+              <w:top w:val="single" w:color="C9B89C" w:sz="4"/>
+              <w:left w:val="single" w:color="C9B89C" w:sz="4"/>
+              <w:bottom w:val="single" w:color="C9B89C" w:sz="4"/>
+              <w:right w:val="single" w:color="C9B89C" w:sz="4"/>
+            </w:tcBorders>
+            <w:tcMar>
+              <w:top w:type="dxa" w:w="70"/>
+              <w:left w:type="dxa" w:w="100"/>
+              <w:bottom w:type="dxa" w:w="70"/>
+              <w:right w:type="dxa" w:w="100"/>
+            </w:tcMar>
+          </w:tcPr>
+          <w:p>
+            <w:pPr>
+              <w:spacing w:after="20" w:line="260"/>
+            </w:pPr>
+            <w:r>
+              <w:rPr>
+                <w:rFonts w:ascii="Arial" w:cs="Arial" w:eastAsia="Arial" w:hAnsi="Arial"/>
+                <w:b w:val="false"/>
+                <w:bCs w:val="false"/>
+                <w:color w:val="2B2118"/>
+                <w:sz w:val="19"/>
+                <w:szCs w:val="19"/>
+              </w:rPr>
+              <w:t xml:space="preserve">Mục 9.</w:t>
+            </w:r>
+          </w:p>
+        </w:tc>
+      </w:tr>
+    </w:tbl>
+    <w:p>
+      <w:pPr>
+        <w:spacing w:after="100"/>
+      </w:pPr>
+    </w:p>
+    <w:p>
+      <w:pPr>
+        <w:pStyle w:val="Heading2"/>
+        <w:spacing w:after="100" w:before="240"/>
+      </w:pPr>
+      <w:r>
+        <w:rPr>
+          <w:rFonts w:ascii="Arial" w:cs="Arial" w:eastAsia="Arial" w:hAnsi="Arial"/>
+          <w:b/>
+          <w:bCs/>
+          <w:color w:val="2B2118"/>
+          <w:sz w:val="25"/>
+          <w:szCs w:val="25"/>
+        </w:rPr>
+        <w:t xml:space="preserve">Còn mở</w:t>
       </w:r>
     </w:p>
     <w:p>
@@ -13662,16 +14786,16 @@
           <w:sz w:val="22"/>
           <w:szCs w:val="22"/>
         </w:rPr>
-        <w:t xml:space="preserve">Thời gian</w:t>
-      </w:r>
-      <w:r>
-        <w:rPr>
-          <w:rFonts w:ascii="Arial" w:cs="Arial" w:eastAsia="Arial" w:hAnsi="Arial"/>
-          <w:color w:val="2B2118"/>
-          <w:sz w:val="22"/>
-          <w:szCs w:val="22"/>
-        </w:rPr>
-        <w:t xml:space="preserve">: giữ ngày game 20 phút và nén lịch chính trị (phương án B, mặc định), giữ lịch cũ (A), hay đưa ngày về 4 phút (C)? (mục 5.2)</w:t>
+        <w:t xml:space="preserve">Điểm quay lại</w:t>
+      </w:r>
+      <w:r>
+        <w:rPr>
+          <w:rFonts w:ascii="Arial" w:cs="Arial" w:eastAsia="Arial" w:hAnsi="Arial"/>
+          <w:color w:val="2B2118"/>
+          <w:sz w:val="22"/>
+          <w:szCs w:val="22"/>
+        </w:rPr>
+        <w:t xml:space="preserve">: một điểm lưu duy nhất ở sứ giả của vòng hiện tại, hay giữ cả các điểm của vòng trước? Tôi đề xuất giữ hai điểm gần nhất.</w:t>
       </w:r>
     </w:p>
     <w:p>
@@ -13692,16 +14816,16 @@
           <w:sz w:val="22"/>
           <w:szCs w:val="22"/>
         </w:rPr>
-        <w:t xml:space="preserve">Số làng</w:t>
-      </w:r>
-      <w:r>
-        <w:rPr>
-          <w:rFonts w:ascii="Arial" w:cs="Arial" w:eastAsia="Arial" w:hAnsi="Arial"/>
-          <w:color w:val="2B2118"/>
-          <w:sz w:val="22"/>
-          <w:szCs w:val="22"/>
-        </w:rPr>
-        <w:t xml:space="preserve">: dùng 6 làng như tài liệu thiết kế, hay bắt đầu với 3 làng hiện có cho vòng đầu?</w:t>
+        <w:t xml:space="preserve">Độ sai của bằng chứng</w:t>
+      </w:r>
+      <w:r>
+        <w:rPr>
+          <w:rFonts w:ascii="Arial" w:cs="Arial" w:eastAsia="Arial" w:hAnsi="Arial"/>
+          <w:color w:val="2B2118"/>
+          <w:sz w:val="22"/>
+          <w:szCs w:val="22"/>
+        </w:rPr>
+        <w:t xml:space="preserve">: 20% có hợp lý? Chỉnh theo mức khó mong muốn và theo cấp của trinh sát hay gián điệp.</w:t>
       </w:r>
     </w:p>
     <w:p>
@@ -13722,196 +14846,16 @@
           <w:sz w:val="22"/>
           <w:szCs w:val="22"/>
         </w:rPr>
-        <w:t xml:space="preserve">Bá chủ</w:t>
-      </w:r>
-      <w:r>
-        <w:rPr>
-          <w:rFonts w:ascii="Arial" w:cs="Arial" w:eastAsia="Arial" w:hAnsi="Arial"/>
-          <w:color w:val="2B2118"/>
-          <w:sz w:val="22"/>
-          <w:szCs w:val="22"/>
-        </w:rPr>
-        <w:t xml:space="preserve">: luôn là một làng cố định (ví dụ Thợ Đồng vì giàu và buôn bán), hay ngẫu nhiên theo tăng trưởng như đề xuất?</w:t>
-      </w:r>
-    </w:p>
-    <w:p>
-      <w:pPr>
-        <w:pStyle w:val="ListParagraph"/>
-        <w:numPr>
-          <w:ilvl w:val="0"/>
-          <w:numId w:val="3"/>
-        </w:numPr>
-        <w:spacing w:after="70" w:line="290"/>
-      </w:pPr>
-      <w:r>
-        <w:rPr>
-          <w:rFonts w:ascii="Arial" w:cs="Arial" w:eastAsia="Arial" w:hAnsi="Arial"/>
-          <w:b/>
-          <w:bCs/>
-          <w:color w:val="2B2118"/>
-          <w:sz w:val="22"/>
-          <w:szCs w:val="22"/>
-        </w:rPr>
-        <w:t xml:space="preserve">Mức thua</w:t>
-      </w:r>
-      <w:r>
-        <w:rPr>
-          <w:rFonts w:ascii="Arial" w:cs="Arial" w:eastAsia="Arial" w:hAnsi="Arial"/>
-          <w:color w:val="2B2118"/>
-          <w:sz w:val="22"/>
-          <w:szCs w:val="22"/>
-        </w:rPr>
-        <w:t xml:space="preserve">: giữ "thua game" hoặc dùng thêm mức "tái lập làng với một phần của cải"? Tôi đề xuất thua theo bậc như mục 7.</w:t>
-      </w:r>
-    </w:p>
-    <w:p>
-      <w:pPr>
-        <w:pStyle w:val="ListParagraph"/>
-        <w:numPr>
-          <w:ilvl w:val="0"/>
-          <w:numId w:val="3"/>
-        </w:numPr>
-        <w:spacing w:after="70" w:line="290"/>
-      </w:pPr>
-      <w:r>
-        <w:rPr>
-          <w:rFonts w:ascii="Arial" w:cs="Arial" w:eastAsia="Arial" w:hAnsi="Arial"/>
-          <w:b/>
-          <w:bCs/>
-          <w:color w:val="2B2118"/>
-          <w:sz w:val="22"/>
-          <w:szCs w:val="22"/>
-        </w:rPr>
-        <w:t xml:space="preserve">Thông tin</w:t>
-      </w:r>
-      <w:r>
-        <w:rPr>
-          <w:rFonts w:ascii="Arial" w:cs="Arial" w:eastAsia="Arial" w:hAnsi="Arial"/>
-          <w:color w:val="2B2118"/>
-          <w:sz w:val="22"/>
-          <w:szCs w:val="22"/>
-        </w:rPr>
-        <w:t xml:space="preserve">: người chơi thấy trực tiếp thanh Lòng tin và Nghi ngờ, hay chỉ thấy gợi ý bằng lời? Tôi đề xuất thấy hơi mờ.</w:t>
-      </w:r>
-    </w:p>
-    <w:p>
-      <w:pPr>
-        <w:pStyle w:val="ListParagraph"/>
-        <w:numPr>
-          <w:ilvl w:val="0"/>
-          <w:numId w:val="3"/>
-        </w:numPr>
-        <w:spacing w:after="70" w:line="290"/>
-      </w:pPr>
-      <w:r>
-        <w:rPr>
-          <w:rFonts w:ascii="Arial" w:cs="Arial" w:eastAsia="Arial" w:hAnsi="Arial"/>
-          <w:b/>
-          <w:bCs/>
-          <w:color w:val="2B2118"/>
-          <w:sz w:val="22"/>
-          <w:szCs w:val="22"/>
-        </w:rPr>
-        <w:t xml:space="preserve">Tạm dừng khi quyết định</w:t>
-      </w:r>
-      <w:r>
-        <w:rPr>
-          <w:rFonts w:ascii="Arial" w:cs="Arial" w:eastAsia="Arial" w:hAnsi="Arial"/>
-          <w:color w:val="2B2118"/>
-          <w:sz w:val="22"/>
-          <w:szCs w:val="22"/>
-        </w:rPr>
-        <w:t xml:space="preserve">: hộp thoại có dừng game không? Tôi đề xuất dừng với sứ giả và các quyết định lớn, còn tin đồn nhỏ thì không dừng.</w:t>
-      </w:r>
-    </w:p>
-    <w:p>
-      <w:pPr>
-        <w:pStyle w:val="ListParagraph"/>
-        <w:numPr>
-          <w:ilvl w:val="0"/>
-          <w:numId w:val="3"/>
-        </w:numPr>
-        <w:spacing w:after="70" w:line="290"/>
-      </w:pPr>
-      <w:r>
-        <w:rPr>
-          <w:rFonts w:ascii="Arial" w:cs="Arial" w:eastAsia="Arial" w:hAnsi="Arial"/>
-          <w:b/>
-          <w:bCs/>
-          <w:color w:val="2B2118"/>
-          <w:sz w:val="22"/>
-          <w:szCs w:val="22"/>
-        </w:rPr>
-        <w:t xml:space="preserve">Chuẩn tiền</w:t>
-      </w:r>
-      <w:r>
-        <w:rPr>
-          <w:rFonts w:ascii="Arial" w:cs="Arial" w:eastAsia="Arial" w:hAnsi="Arial"/>
-          <w:color w:val="2B2118"/>
-          <w:sz w:val="22"/>
-          <w:szCs w:val="22"/>
-        </w:rPr>
-        <w:t xml:space="preserve">: danh sách vật làm tiền (vỏ sò, hạt cườm xương, đá đen mài, lông chim) có đủ, và game hiện dùng vỏ sò làm mặc định có ổn không?</w:t>
-      </w:r>
-    </w:p>
-    <w:p>
-      <w:pPr>
-        <w:pStyle w:val="ListParagraph"/>
-        <w:numPr>
-          <w:ilvl w:val="0"/>
-          <w:numId w:val="3"/>
-        </w:numPr>
-        <w:spacing w:after="70" w:line="290"/>
-      </w:pPr>
-      <w:r>
-        <w:rPr>
-          <w:rFonts w:ascii="Arial" w:cs="Arial" w:eastAsia="Arial" w:hAnsi="Arial"/>
-          <w:b/>
-          <w:bCs/>
-          <w:color w:val="2B2118"/>
-          <w:sz w:val="22"/>
-          <w:szCs w:val="22"/>
-        </w:rPr>
-        <w:t xml:space="preserve">Giết sứ giả</w:t>
-      </w:r>
-      <w:r>
-        <w:rPr>
-          <w:rFonts w:ascii="Arial" w:cs="Arial" w:eastAsia="Arial" w:hAnsi="Arial"/>
-          <w:color w:val="2B2118"/>
-          <w:sz w:val="22"/>
-          <w:szCs w:val="22"/>
-        </w:rPr>
-        <w:t xml:space="preserve">: có cho đường sống nếu người chơi chuẩn bị rất kỹ, hay thua chắc?</w:t>
-      </w:r>
-    </w:p>
-    <w:p>
-      <w:pPr>
-        <w:pStyle w:val="ListParagraph"/>
-        <w:numPr>
-          <w:ilvl w:val="0"/>
-          <w:numId w:val="3"/>
-        </w:numPr>
-        <w:spacing w:after="70" w:line="290"/>
-      </w:pPr>
-      <w:r>
-        <w:rPr>
-          <w:rFonts w:ascii="Arial" w:cs="Arial" w:eastAsia="Arial" w:hAnsi="Arial"/>
-          <w:b/>
-          <w:bCs/>
-          <w:color w:val="2B2118"/>
-          <w:sz w:val="22"/>
-          <w:szCs w:val="22"/>
-        </w:rPr>
-        <w:t xml:space="preserve">Làm vua</w:t>
-      </w:r>
-      <w:r>
-        <w:rPr>
-          <w:rFonts w:ascii="Arial" w:cs="Arial" w:eastAsia="Arial" w:hAnsi="Arial"/>
-          <w:color w:val="2B2118"/>
-          <w:sz w:val="22"/>
-          <w:szCs w:val="22"/>
-        </w:rPr>
-        <w:t xml:space="preserve">: sau khi hạ bá chủ, người chơi giữ ngôi theo cơ chế mục 9 hay chuyển luôn sang Cổng thời đại?</w:t>
+        <w:t xml:space="preserve">Lãnh thổ và tài nguyên</w:t>
+      </w:r>
+      <w:r>
+        <w:rPr>
+          <w:rFonts w:ascii="Arial" w:cs="Arial" w:eastAsia="Arial" w:hAnsi="Arial"/>
+          <w:color w:val="2B2118"/>
+          <w:sz w:val="22"/>
+          <w:szCs w:val="22"/>
+        </w:rPr>
+        <w:t xml:space="preserve">: ý tưởng tài nguyên không hồi sinh, lãnh thổ làng, nhiều lửa trại và nông trại (tin nhắn trước) sẽ có tài liệu riêng sau khi cân bằng kinh tế.</w:t>
       </w:r>
     </w:p>
     <w:sectPr>

</xml_diff>